<commit_message>
release 4.31: verdict words one set for every walkthrough and the line (a)ccept / (m)odify / (r)eject / (p)ark, write and ?? as the principal's words; an output in two steps - /render with a plain file through pandoc, the new /publish with the designed file through a model, the recipe's Format section, the ledger's Published table; raw git denied to Claude and no attribution trailer; the release checks and the single-source-of-truth sweep of 2026-09-27 settled - stale README no longer a finding, provenance verified by light alone, one-line reminders not restatements, three shapes given an owner, DEC.0140; the three pitches re-rendered; THR.0430 opened for a command that ends a session; README and release notes rendered at intent 4.31; light check conforms
</commit_message>
<xml_diff>
--- a/projects/forge/renders/ceo-pitch.docx
+++ b/projects/forge/renders/ceo-pitch.docx
@@ -5,7 +5,7 @@
     <w:bookmarkStart w:id="15" w:name="forge-of-thought"/>
     <w:p>
       <w:pPr>
-        <w:pStyle w:val="Nadpis1"/>
+        <w:pStyle w:val="Heading1"/>
       </w:pPr>
       <w:r>
         <w:t xml:space="preserve">Forge of Thought</w:t>
@@ -40,7 +40,7 @@
     <w:bookmarkStart w:id="9" w:name="what-it-is"/>
     <w:p>
       <w:pPr>
-        <w:pStyle w:val="Nadpis2"/>
+        <w:pStyle w:val="Heading2"/>
       </w:pPr>
       <w:r>
         <w:t xml:space="preserve">What it is</w:t>
@@ -51,44 +51,50 @@
         <w:pStyle w:val="FirstParagraph"/>
       </w:pPr>
       <w:r>
-        <w:t xml:space="preserve">Forge of Thought is a way of working with AI on the ideas a company</w:t>
-      </w:r>
-      <w:r>
-        <w:t xml:space="preserve"> </w:t>
-      </w:r>
-      <w:r>
-        <w:t xml:space="preserve">runs on - a process redesign, a platform, an organisational change.</w:t>
-      </w:r>
-      <w:r>
-        <w:t xml:space="preserve"> </w:t>
-      </w:r>
-      <w:r>
-        <w:t xml:space="preserve">You do not ask it a question; you think the idea through with it</w:t>
-      </w:r>
-      <w:r>
-        <w:t xml:space="preserve"> </w:t>
-      </w:r>
-      <w:r>
-        <w:t xml:space="preserve">until it is written down completely, tested against opposition and</w:t>
-      </w:r>
-      <w:r>
-        <w:t xml:space="preserve"> </w:t>
-      </w:r>
-      <w:r>
-        <w:t xml:space="preserve">ready to hand to the people who will carry it out. A chat gives you</w:t>
-      </w:r>
-      <w:r>
-        <w:t xml:space="preserve"> </w:t>
-      </w:r>
-      <w:r>
-        <w:t xml:space="preserve">an answer; the forge gives you a decision you can stand behind.</w:t>
+        <w:t xml:space="preserve">Forge of Thought is a way of turning an idea into a decision and an</w:t>
+      </w:r>
+      <w:r>
+        <w:t xml:space="preserve"> </w:t>
+      </w:r>
+      <w:r>
+        <w:t xml:space="preserve">assignment that a team can act on. You know what a chat does: you</w:t>
+      </w:r>
+      <w:r>
+        <w:t xml:space="preserve"> </w:t>
+      </w:r>
+      <w:r>
+        <w:t xml:space="preserve">ask, it answers, and the answer is as good as your question. The</w:t>
+      </w:r>
+      <w:r>
+        <w:t xml:space="preserve"> </w:t>
+      </w:r>
+      <w:r>
+        <w:t xml:space="preserve">forge works the other way round: it questions you until the idea is</w:t>
+      </w:r>
+      <w:r>
+        <w:t xml:space="preserve"> </w:t>
+      </w:r>
+      <w:r>
+        <w:t xml:space="preserve">whole, has it attacked by opponents that never saw the conversation,</w:t>
+      </w:r>
+      <w:r>
+        <w:t xml:space="preserve"> </w:t>
+      </w:r>
+      <w:r>
+        <w:t xml:space="preserve">and records who decided what and why, so what leaves it is a</w:t>
+      </w:r>
+      <w:r>
+        <w:t xml:space="preserve"> </w:t>
+      </w:r>
+      <w:r>
+        <w:t xml:space="preserve">decision you can stand behind, not an answer you received.</w:t>
       </w:r>
     </w:p>
     <w:bookmarkEnd w:id="9"/>
     <w:bookmarkStart w:id="10" w:name="what-it-can-mean-for-your-company"/>
     <w:p>
       <w:pPr>
-        <w:pStyle w:val="Nadpis2"/>
+        <w:pStyle w:val="Heading2"/>
       </w:pPr>
       <w:r>
         <w:t xml:space="preserve">What it can mean for your company</w:t>
@@ -119,7 +125,7 @@
         <w:t xml:space="preserve"> </w:t>
       </w:r>
       <w:r>
-        <w:t xml:space="preserve">assignment is complete and precise the first time and the rounds</w:t>
+        <w:t xml:space="preserve">assignment is complete and precise the first time, and the rounds</w:t>
       </w:r>
       <w:r>
         <w:t xml:space="preserve"> </w:t>
@@ -131,19 +137,19 @@
         <w:t xml:space="preserve"> </w:t>
       </w:r>
       <w:r>
-        <w:t xml:space="preserve">The idea is forged once and cast into an output for every</w:t>
-      </w:r>
-      <w:r>
-        <w:t xml:space="preserve"> </w:t>
-      </w:r>
-      <w:r>
-        <w:t xml:space="preserve">audience; when the idea changes, every output follows, and nobody</w:t>
-      </w:r>
-      <w:r>
-        <w:t xml:space="preserve"> </w:t>
-      </w:r>
-      <w:r>
-        <w:t xml:space="preserve">rewrites five documents.</w:t>
+        <w:t xml:space="preserve">One forged substance is cast into an output for every audience,</w:t>
+      </w:r>
+      <w:r>
+        <w:t xml:space="preserve"> </w:t>
+      </w:r>
+      <w:r>
+        <w:t xml:space="preserve">and when the idea changes every output follows, so nobody rewrites</w:t>
+      </w:r>
+      <w:r>
+        <w:t xml:space="preserve"> </w:t>
+      </w:r>
+      <w:r>
+        <w:t xml:space="preserve">five documents.</w:t>
       </w:r>
     </w:p>
     <w:p>
@@ -189,7 +195,7 @@
         <w:t xml:space="preserve"> </w:t>
       </w:r>
       <w:r>
-        <w:t xml:space="preserve">hand on every document.</w:t>
+        <w:t xml:space="preserve">hand on every document, so it pays where review is usually skipped.</w:t>
       </w:r>
     </w:p>
     <w:p>
@@ -217,13 +223,13 @@
         <w:t xml:space="preserve"> </w:t>
       </w:r>
       <w:r>
-        <w:t xml:space="preserve">person composes every sentence and answers for the result. Every</w:t>
-      </w:r>
-      <w:r>
-        <w:t xml:space="preserve"> </w:t>
-      </w:r>
-      <w:r>
-        <w:t xml:space="preserve">decision carries a date and a reason, readable a year later.</w:t>
+        <w:t xml:space="preserve">person composes every sentence and answers for the result, and</w:t>
+      </w:r>
+      <w:r>
+        <w:t xml:space="preserve"> </w:t>
+      </w:r>
+      <w:r>
+        <w:t xml:space="preserve">every decision carries a date and a reason, readable a year later.</w:t>
       </w:r>
     </w:p>
     <w:p>
@@ -245,25 +251,25 @@
         <w:t xml:space="preserve"> </w:t>
       </w:r>
       <w:r>
-        <w:t xml:space="preserve">The same discipline holds from the</w:t>
-      </w:r>
-      <w:r>
-        <w:t xml:space="preserve"> </w:t>
-      </w:r>
-      <w:r>
-        <w:t xml:space="preserve">CEO to the analyst, and shared requirements - security is the</w:t>
-      </w:r>
-      <w:r>
-        <w:t xml:space="preserve"> </w:t>
-      </w:r>
-      <w:r>
-        <w:t xml:space="preserve">example - are applied to every project in the same way. Quality</w:t>
-      </w:r>
-      <w:r>
-        <w:t xml:space="preserve"> </w:t>
-      </w:r>
-      <w:r>
-        <w:t xml:space="preserve">stops depending on who happened to write the document.</w:t>
+        <w:t xml:space="preserve">The same discipline applies from</w:t>
+      </w:r>
+      <w:r>
+        <w:t xml:space="preserve"> </w:t>
+      </w:r>
+      <w:r>
+        <w:t xml:space="preserve">the CEO to the analyst, and shared requirements - security is the</w:t>
+      </w:r>
+      <w:r>
+        <w:t xml:space="preserve"> </w:t>
+      </w:r>
+      <w:r>
+        <w:t xml:space="preserve">example - reach every project in the same way, so quality stops</w:t>
+      </w:r>
+      <w:r>
+        <w:t xml:space="preserve"> </w:t>
+      </w:r>
+      <w:r>
+        <w:t xml:space="preserve">depending on who happened to write the document.</w:t>
       </w:r>
     </w:p>
     <w:p>
@@ -297,26 +303,26 @@
         <w:t xml:space="preserve"> </w:t>
       </w:r>
       <w:r>
-        <w:t xml:space="preserve">and business analysts, UX/UI and test analysts as the forge</w:t>
-      </w:r>
-      <w:r>
-        <w:t xml:space="preserve"> </w:t>
-      </w:r>
-      <w:r>
-        <w:t xml:space="preserve">grows - work with AI by design, in one governed way. The AI is a</w:t>
-      </w:r>
-      <w:r>
-        <w:t xml:space="preserve"> </w:t>
-      </w:r>
-      <w:r>
-        <w:t xml:space="preserve">cognitive extension of the person and never a substitute for them.</w:t>
+        <w:t xml:space="preserve">business analysts, UX/UI, test analysts as the chain grows - work</w:t>
+      </w:r>
+      <w:r>
+        <w:t xml:space="preserve"> </w:t>
+      </w:r>
+      <w:r>
+        <w:t xml:space="preserve">with AI by design, in one governed way, with the AI as a cognitive</w:t>
+      </w:r>
+      <w:r>
+        <w:t xml:space="preserve"> </w:t>
+      </w:r>
+      <w:r>
+        <w:t xml:space="preserve">extension of the person and never a substitute for them.</w:t>
       </w:r>
     </w:p>
     <w:bookmarkEnd w:id="10"/>
     <w:bookmarkStart w:id="11" w:name="where-it-works-today-and-where-it-goes"/>
     <w:p>
       <w:pPr>
-        <w:pStyle w:val="Nadpis2"/>
+        <w:pStyle w:val="Heading2"/>
       </w:pPr>
       <w:r>
         <w:t xml:space="preserve">Where it works today, and where it goes</w:t>
@@ -339,25 +345,25 @@
         <w:t xml:space="preserve"> </w:t>
       </w:r>
       <w:r>
-        <w:t xml:space="preserve">run AI and automation in production, and the transformation of an IT</w:t>
-      </w:r>
-      <w:r>
-        <w:t xml:space="preserve"> </w:t>
-      </w:r>
-      <w:r>
-        <w:t xml:space="preserve">department into one that works with AI by design. Both are already</w:t>
-      </w:r>
-      <w:r>
-        <w:t xml:space="preserve"> </w:t>
-      </w:r>
-      <w:r>
-        <w:t xml:space="preserve">handed over to the people who take them further, and on both, teams</w:t>
-      </w:r>
-      <w:r>
-        <w:t xml:space="preserve"> </w:t>
-      </w:r>
-      <w:r>
-        <w:t xml:space="preserve">work with the forge themselves. Beside them I use it every day for</w:t>
+        <w:t xml:space="preserve">run AI and automation in production, and the transformation of an</w:t>
+      </w:r>
+      <w:r>
+        <w:t xml:space="preserve"> </w:t>
+      </w:r>
+      <w:r>
+        <w:t xml:space="preserve">IT department into one that works with AI by design. Both are</w:t>
+      </w:r>
+      <w:r>
+        <w:t xml:space="preserve"> </w:t>
+      </w:r>
+      <w:r>
+        <w:t xml:space="preserve">already handed over to the people who take them further, and on</w:t>
+      </w:r>
+      <w:r>
+        <w:t xml:space="preserve"> </w:t>
+      </w:r>
+      <w:r>
+        <w:t xml:space="preserve">both, teams now work with the forge themselves. I use it daily for</w:t>
       </w:r>
       <w:r>
         <w:t xml:space="preserve"> </w:t>
@@ -396,7 +402,7 @@
     <w:bookmarkStart w:id="12" w:name="where-it-honestly-stands"/>
     <w:p>
       <w:pPr>
-        <w:pStyle w:val="Nadpis2"/>
+        <w:pStyle w:val="Heading2"/>
       </w:pPr>
       <w:r>
         <w:t xml:space="preserve">Where it honestly stands</w:t>
@@ -417,7 +423,7 @@
         <w:t xml:space="preserve"> </w:t>
       </w:r>
       <w:r>
-        <w:t xml:space="preserve">way of working that runs on an AI coding assistant your company</w:t>
+        <w:t xml:space="preserve">way of working that runs on an AI coding assistant a company</w:t>
       </w:r>
       <w:r>
         <w:t xml:space="preserve"> </w:t>
@@ -471,20 +477,14 @@
         </w:numPr>
       </w:pPr>
       <w:r>
-        <w:t xml:space="preserve">It is young, it is the work of one author, and there is long work</w:t>
-      </w:r>
-      <w:r>
-        <w:t xml:space="preserve"> </w:t>
-      </w:r>
-      <w:r>
-        <w:t xml:space="preserve">ahead.</w:t>
+        <w:t xml:space="preserve">It is young, the work of one author, and there is long work ahead.</w:t>
       </w:r>
     </w:p>
     <w:bookmarkEnd w:id="12"/>
     <w:bookmarkStart w:id="13" w:name="what-i-would-suggest"/>
     <w:p>
       <w:pPr>
-        <w:pStyle w:val="Nadpis2"/>
+        <w:pStyle w:val="Heading2"/>
       </w:pPr>
       <w:r>
         <w:t xml:space="preserve">What I would suggest</w:t>
@@ -501,32 +501,32 @@
         <w:t xml:space="preserve"> </w:t>
       </w:r>
       <w:r>
-        <w:t xml:space="preserve">repository carries a note written for them and a README that</w:t>
-      </w:r>
-      <w:r>
-        <w:t xml:space="preserve"> </w:t>
-      </w:r>
-      <w:r>
-        <w:t xml:space="preserve">describes the forge more broadly:</w:t>
-      </w:r>
-      <w:r>
-        <w:t xml:space="preserve"> </w:t>
-      </w:r>
-      <w:r>
-        <w:t xml:space="preserve">https://github.com/pche-broken-artist/forge-of-thought</w:t>
-      </w:r>
-      <w:r>
-        <w:t xml:space="preserve"> </w:t>
-      </w:r>
-      <w:r>
-        <w:t xml:space="preserve">And tell me whether this could be useful to you - and if not, why.</w:t>
+        <w:t xml:space="preserve">repository at https://github.com/pche-broken-artist/forge-of-thought</w:t>
+      </w:r>
+      <w:r>
+        <w:t xml:space="preserve"> </w:t>
+      </w:r>
+      <w:r>
+        <w:t xml:space="preserve">carries a note written for them and a README that describes the</w:t>
+      </w:r>
+      <w:r>
+        <w:t xml:space="preserve"> </w:t>
+      </w:r>
+      <w:r>
+        <w:t xml:space="preserve">forge more broadly. And tell me whether this could be useful to you,</w:t>
+      </w:r>
+      <w:r>
+        <w:t xml:space="preserve"> </w:t>
+      </w:r>
+      <w:r>
+        <w:t xml:space="preserve">and if not, why.</w:t>
       </w:r>
     </w:p>
     <w:bookmarkEnd w:id="13"/>
     <w:bookmarkStart w:id="14" w:name="about-me"/>
     <w:p>
       <w:pPr>
-        <w:pStyle w:val="Nadpis2"/>
+        <w:pStyle w:val="Heading2"/>
       </w:pPr>
       <w:r>
         <w:t xml:space="preserve">About me</w:t>
@@ -537,37 +537,37 @@
         <w:pStyle w:val="FirstParagraph"/>
       </w:pPr>
       <w:r>
-        <w:t xml:space="preserve">I am Petr Chlumský: CTO by profession, builder by nature. I have</w:t>
-      </w:r>
-      <w:r>
-        <w:t xml:space="preserve"> </w:t>
-      </w:r>
-      <w:r>
-        <w:t xml:space="preserve">been a CTO for two decades, first of some of the largest Czech</w:t>
-      </w:r>
-      <w:r>
-        <w:t xml:space="preserve"> </w:t>
-      </w:r>
-      <w:r>
-        <w:t xml:space="preserve">online companies, today within a global group that is the second</w:t>
-      </w:r>
-      <w:r>
-        <w:t xml:space="preserve"> </w:t>
-      </w:r>
-      <w:r>
-        <w:t xml:space="preserve">largest in the world in its field, and I assign work to teams every</w:t>
-      </w:r>
-      <w:r>
-        <w:t xml:space="preserve"> </w:t>
-      </w:r>
-      <w:r>
-        <w:t xml:space="preserve">day. What draws me to AI is not automation but cognition: AI as a</w:t>
-      </w:r>
-      <w:r>
-        <w:t xml:space="preserve"> </w:t>
-      </w:r>
-      <w:r>
-        <w:t xml:space="preserve">cognitive extension of the human.</w:t>
+        <w:t xml:space="preserve">I am Petr Chlumský, CTO by profession and builder by nature. I have</w:t>
+      </w:r>
+      <w:r>
+        <w:t xml:space="preserve"> </w:t>
+      </w:r>
+      <w:r>
+        <w:t xml:space="preserve">spent two decades as a CTO, first of some of the largest Czech online</w:t>
+      </w:r>
+      <w:r>
+        <w:t xml:space="preserve"> </w:t>
+      </w:r>
+      <w:r>
+        <w:t xml:space="preserve">companies and today within a global group that is the second largest</w:t>
+      </w:r>
+      <w:r>
+        <w:t xml:space="preserve"> </w:t>
+      </w:r>
+      <w:r>
+        <w:t xml:space="preserve">in the world in its field, and I assign work to teams every day. What</w:t>
+      </w:r>
+      <w:r>
+        <w:t xml:space="preserve"> </w:t>
+      </w:r>
+      <w:r>
+        <w:t xml:space="preserve">draws me to AI is not automation but cognition: AI as a cognitive</w:t>
+      </w:r>
+      <w:r>
+        <w:t xml:space="preserve"> </w:t>
+      </w:r>
+      <w:r>
+        <w:t xml:space="preserve">extension of the human.</w:t>
       </w:r>
     </w:p>
     <w:p>
@@ -601,10 +601,10 @@
     <w:bookmarkEnd w:id="14"/>
     <w:bookmarkEnd w:id="15"/>
     <w:sectPr>
-      <w:pgSz w:h="16839" w:w="11907"/>
-      <w:pgMar w:bottom="1440" w:footer="708" w:gutter="0" w:header="708" w:left="1440" w:right="1440" w:top="1440"/>
-      <w:cols w:space="708"/>
-      <w:docGrid w:linePitch="360"/>
+      <w:footnotePr>
+        <w:numRestart w:val="eachSect"/>
+      </w:footnotePr>
+      <w:pgSz w:h="16838" w:w="11906"/>
     </w:sectPr>
   </w:body>
 </w:document>
@@ -827,414 +827,191 @@
 </file>
 
 <file path=word/styles.xml><?xml version="1.0" encoding="utf-8"?>
-<w:styles xmlns:mc="http://schemas.openxmlformats.org/markup-compatibility/2006" xmlns:r="http://schemas.openxmlformats.org/officeDocument/2006/relationships" xmlns:w="http://schemas.openxmlformats.org/wordprocessingml/2006/main" xmlns:w14="http://schemas.microsoft.com/office/word/2010/wordml" xmlns:w15="http://schemas.microsoft.com/office/word/2012/wordml" xmlns:w16="http://schemas.microsoft.com/office/word/2018/wordml" xmlns:w16cex="http://schemas.microsoft.com/office/word/2018/wordml/cex" xmlns:w16cid="http://schemas.microsoft.com/office/word/2016/wordml/cid" xmlns:w16du="http://schemas.microsoft.com/office/word/2023/wordml/word16du" xmlns:w16sdtdh="http://schemas.microsoft.com/office/word/2020/wordml/sdtdatahash" xmlns:w16sdtfl="http://schemas.microsoft.com/office/word/2024/wordml/sdtformatlock" xmlns:w16se="http://schemas.microsoft.com/office/word/2015/wordml/symex" mc:Ignorable="w14 w15 w16se w16cid w16 w16cex w16sdtdh w16sdtfl w16du">
+<w:styles xmlns:r="http://schemas.openxmlformats.org/officeDocument/2006/relationships" xmlns:w="http://schemas.openxmlformats.org/wordprocessingml/2006/main">
   <w:docDefaults>
     <w:rPrDefault>
       <w:rPr>
-        <w:rFonts w:asciiTheme="minorHAnsi" w:cstheme="minorBidi" w:eastAsiaTheme="minorHAnsi" w:hAnsiTheme="minorHAnsi"/>
-        <w:kern w:val="2"/>
+        <w:rFonts w:asciiTheme="minorHAnsi" w:cstheme="minorBidi" w:eastAsiaTheme="minorEastAsia" w:hAnsiTheme="minorHAnsi"/>
         <w:sz w:val="24"/>
         <w:szCs w:val="24"/>
-        <w:lang w:bidi="ar-SA" w:eastAsia="en-US" w:val="en-US"/>
-        <w14:ligatures w14:val="standardContextual"/>
+        <w:lang w:bidi="ar-SA" w:eastAsia="zh-CN" w:val="en-US"/>
       </w:rPr>
     </w:rPrDefault>
     <w:pPrDefault>
       <w:pPr>
-        <w:spacing w:after="160" w:line="278" w:lineRule="auto"/>
+        <w:spacing w:after="200"/>
       </w:pPr>
     </w:pPrDefault>
   </w:docDefaults>
-  <w:latentStyles w:count="376" w:defLockedState="0" w:defQFormat="0" w:defSemiHidden="0" w:defUIPriority="99" w:defUnhideWhenUsed="0">
-    <w:lsdException w:name="Normal" w:qFormat="1" w:uiPriority="0"/>
-    <w:lsdException w:name="heading 1" w:qFormat="1" w:uiPriority="9"/>
-    <w:lsdException w:name="heading 2" w:qFormat="1" w:semiHidden="1" w:uiPriority="9" w:unhideWhenUsed="1"/>
-    <w:lsdException w:name="heading 3" w:qFormat="1" w:semiHidden="1" w:uiPriority="9" w:unhideWhenUsed="1"/>
-    <w:lsdException w:name="heading 4" w:qFormat="1" w:semiHidden="1" w:uiPriority="9" w:unhideWhenUsed="1"/>
-    <w:lsdException w:name="heading 5" w:qFormat="1" w:semiHidden="1" w:uiPriority="9" w:unhideWhenUsed="1"/>
-    <w:lsdException w:name="heading 6" w:qFormat="1" w:semiHidden="1" w:uiPriority="9" w:unhideWhenUsed="1"/>
-    <w:lsdException w:name="heading 7" w:qFormat="1" w:semiHidden="1" w:uiPriority="9" w:unhideWhenUsed="1"/>
-    <w:lsdException w:name="heading 8" w:qFormat="1" w:semiHidden="1" w:uiPriority="9" w:unhideWhenUsed="1"/>
-    <w:lsdException w:name="heading 9" w:qFormat="1" w:semiHidden="1" w:uiPriority="9" w:unhideWhenUsed="1"/>
-    <w:lsdException w:name="index 1" w:semiHidden="1" w:unhideWhenUsed="1"/>
-    <w:lsdException w:name="index 2" w:semiHidden="1" w:unhideWhenUsed="1"/>
-    <w:lsdException w:name="index 3" w:semiHidden="1" w:unhideWhenUsed="1"/>
-    <w:lsdException w:name="index 4" w:semiHidden="1" w:unhideWhenUsed="1"/>
-    <w:lsdException w:name="index 5" w:semiHidden="1" w:unhideWhenUsed="1"/>
-    <w:lsdException w:name="index 6" w:semiHidden="1" w:unhideWhenUsed="1"/>
-    <w:lsdException w:name="index 7" w:semiHidden="1" w:unhideWhenUsed="1"/>
-    <w:lsdException w:name="index 8" w:semiHidden="1" w:unhideWhenUsed="1"/>
-    <w:lsdException w:name="index 9" w:semiHidden="1" w:unhideWhenUsed="1"/>
-    <w:lsdException w:name="toc 1" w:semiHidden="1" w:uiPriority="39" w:unhideWhenUsed="1"/>
-    <w:lsdException w:name="toc 2" w:semiHidden="1" w:uiPriority="39" w:unhideWhenUsed="1"/>
-    <w:lsdException w:name="toc 3" w:semiHidden="1" w:uiPriority="39" w:unhideWhenUsed="1"/>
-    <w:lsdException w:name="toc 4" w:semiHidden="1" w:uiPriority="39" w:unhideWhenUsed="1"/>
-    <w:lsdException w:name="toc 5" w:semiHidden="1" w:uiPriority="39" w:unhideWhenUsed="1"/>
-    <w:lsdException w:name="toc 6" w:semiHidden="1" w:uiPriority="39" w:unhideWhenUsed="1"/>
-    <w:lsdException w:name="toc 7" w:semiHidden="1" w:uiPriority="39" w:unhideWhenUsed="1"/>
-    <w:lsdException w:name="toc 8" w:semiHidden="1" w:uiPriority="39" w:unhideWhenUsed="1"/>
-    <w:lsdException w:name="toc 9" w:semiHidden="1" w:uiPriority="39" w:unhideWhenUsed="1"/>
-    <w:lsdException w:name="Normal Indent" w:semiHidden="1" w:unhideWhenUsed="1"/>
-    <w:lsdException w:name="footnote text" w:semiHidden="1" w:unhideWhenUsed="1"/>
-    <w:lsdException w:name="annotation text" w:semiHidden="1" w:unhideWhenUsed="1"/>
-    <w:lsdException w:name="header" w:semiHidden="1" w:unhideWhenUsed="1"/>
-    <w:lsdException w:name="footer" w:semiHidden="1" w:unhideWhenUsed="1"/>
-    <w:lsdException w:name="index heading" w:semiHidden="1" w:unhideWhenUsed="1"/>
-    <w:lsdException w:name="caption" w:qFormat="1" w:semiHidden="1" w:uiPriority="35" w:unhideWhenUsed="1"/>
-    <w:lsdException w:name="table of figures" w:semiHidden="1" w:unhideWhenUsed="1"/>
-    <w:lsdException w:name="envelope address" w:semiHidden="1" w:unhideWhenUsed="1"/>
-    <w:lsdException w:name="envelope return" w:semiHidden="1" w:unhideWhenUsed="1"/>
-    <w:lsdException w:name="footnote reference" w:semiHidden="1" w:unhideWhenUsed="1"/>
-    <w:lsdException w:name="annotation reference" w:semiHidden="1" w:unhideWhenUsed="1"/>
-    <w:lsdException w:name="line number" w:semiHidden="1" w:unhideWhenUsed="1"/>
-    <w:lsdException w:name="page number" w:semiHidden="1" w:unhideWhenUsed="1"/>
-    <w:lsdException w:name="endnote reference" w:semiHidden="1" w:unhideWhenUsed="1"/>
-    <w:lsdException w:name="endnote text" w:semiHidden="1" w:unhideWhenUsed="1"/>
-    <w:lsdException w:name="table of authorities" w:semiHidden="1" w:unhideWhenUsed="1"/>
-    <w:lsdException w:name="macro" w:semiHidden="1" w:unhideWhenUsed="1"/>
-    <w:lsdException w:name="toa heading" w:semiHidden="1" w:unhideWhenUsed="1"/>
-    <w:lsdException w:name="List" w:semiHidden="1" w:unhideWhenUsed="1"/>
-    <w:lsdException w:name="List Bullet" w:semiHidden="1" w:unhideWhenUsed="1"/>
-    <w:lsdException w:name="List Number" w:semiHidden="1" w:unhideWhenUsed="1"/>
-    <w:lsdException w:name="List 2" w:semiHidden="1" w:unhideWhenUsed="1"/>
-    <w:lsdException w:name="List 3" w:semiHidden="1" w:unhideWhenUsed="1"/>
-    <w:lsdException w:name="List 4" w:semiHidden="1" w:unhideWhenUsed="1"/>
-    <w:lsdException w:name="List 5" w:semiHidden="1" w:unhideWhenUsed="1"/>
-    <w:lsdException w:name="List Bullet 2" w:semiHidden="1" w:unhideWhenUsed="1"/>
-    <w:lsdException w:name="List Bullet 3" w:semiHidden="1" w:unhideWhenUsed="1"/>
-    <w:lsdException w:name="List Bullet 4" w:semiHidden="1" w:unhideWhenUsed="1"/>
-    <w:lsdException w:name="List Bullet 5" w:semiHidden="1" w:unhideWhenUsed="1"/>
-    <w:lsdException w:name="List Number 2" w:semiHidden="1" w:unhideWhenUsed="1"/>
-    <w:lsdException w:name="List Number 3" w:semiHidden="1" w:unhideWhenUsed="1"/>
-    <w:lsdException w:name="List Number 4" w:semiHidden="1" w:unhideWhenUsed="1"/>
-    <w:lsdException w:name="List Number 5" w:semiHidden="1" w:unhideWhenUsed="1"/>
-    <w:lsdException w:name="Title" w:qFormat="1" w:uiPriority="10"/>
-    <w:lsdException w:name="Closing" w:semiHidden="1" w:unhideWhenUsed="1"/>
-    <w:lsdException w:name="Signature" w:semiHidden="1" w:unhideWhenUsed="1"/>
-    <w:lsdException w:name="Default Paragraph Font" w:semiHidden="1" w:uiPriority="1" w:unhideWhenUsed="1"/>
-    <w:lsdException w:name="Body Text" w:semiHidden="1" w:unhideWhenUsed="1"/>
-    <w:lsdException w:name="Body Text Indent" w:semiHidden="1" w:unhideWhenUsed="1"/>
-    <w:lsdException w:name="List Continue" w:semiHidden="1" w:unhideWhenUsed="1"/>
-    <w:lsdException w:name="List Continue 2" w:semiHidden="1" w:unhideWhenUsed="1"/>
-    <w:lsdException w:name="List Continue 3" w:semiHidden="1" w:unhideWhenUsed="1"/>
-    <w:lsdException w:name="List Continue 4" w:semiHidden="1" w:unhideWhenUsed="1"/>
-    <w:lsdException w:name="List Continue 5" w:semiHidden="1" w:unhideWhenUsed="1"/>
-    <w:lsdException w:name="Message Header" w:semiHidden="1" w:unhideWhenUsed="1"/>
-    <w:lsdException w:name="Subtitle" w:qFormat="1" w:uiPriority="11"/>
-    <w:lsdException w:name="Salutation" w:semiHidden="1" w:unhideWhenUsed="1"/>
-    <w:lsdException w:name="Date" w:semiHidden="1" w:unhideWhenUsed="1"/>
-    <w:lsdException w:name="Body Text First Indent" w:semiHidden="1" w:unhideWhenUsed="1"/>
-    <w:lsdException w:name="Body Text First Indent 2" w:semiHidden="1" w:unhideWhenUsed="1"/>
-    <w:lsdException w:name="Note Heading" w:semiHidden="1" w:unhideWhenUsed="1"/>
-    <w:lsdException w:name="Body Text 2" w:semiHidden="1" w:unhideWhenUsed="1"/>
-    <w:lsdException w:name="Body Text 3" w:semiHidden="1" w:unhideWhenUsed="1"/>
-    <w:lsdException w:name="Body Text Indent 2" w:semiHidden="1" w:unhideWhenUsed="1"/>
-    <w:lsdException w:name="Body Text Indent 3" w:semiHidden="1" w:unhideWhenUsed="1"/>
-    <w:lsdException w:name="Block Text" w:semiHidden="1" w:unhideWhenUsed="1"/>
-    <w:lsdException w:name="Hyperlink" w:semiHidden="1" w:unhideWhenUsed="1"/>
-    <w:lsdException w:name="FollowedHyperlink" w:semiHidden="1" w:unhideWhenUsed="1"/>
-    <w:lsdException w:name="Strong" w:qFormat="1" w:uiPriority="22"/>
-    <w:lsdException w:name="Emphasis" w:qFormat="1" w:uiPriority="20"/>
-    <w:lsdException w:name="Document Map" w:semiHidden="1" w:unhideWhenUsed="1"/>
-    <w:lsdException w:name="Plain Text" w:semiHidden="1" w:unhideWhenUsed="1"/>
-    <w:lsdException w:name="E-mail Signature" w:semiHidden="1" w:unhideWhenUsed="1"/>
-    <w:lsdException w:name="HTML Top of Form" w:semiHidden="1" w:unhideWhenUsed="1"/>
-    <w:lsdException w:name="HTML Bottom of Form" w:semiHidden="1" w:unhideWhenUsed="1"/>
-    <w:lsdException w:name="Normal (Web)" w:semiHidden="1" w:unhideWhenUsed="1"/>
-    <w:lsdException w:name="HTML Acronym" w:semiHidden="1" w:unhideWhenUsed="1"/>
-    <w:lsdException w:name="HTML Address" w:semiHidden="1" w:unhideWhenUsed="1"/>
-    <w:lsdException w:name="HTML Cite" w:semiHidden="1" w:unhideWhenUsed="1"/>
-    <w:lsdException w:name="HTML Code" w:semiHidden="1" w:unhideWhenUsed="1"/>
-    <w:lsdException w:name="HTML Definition" w:semiHidden="1" w:unhideWhenUsed="1"/>
-    <w:lsdException w:name="HTML Keyboard" w:semiHidden="1" w:unhideWhenUsed="1"/>
-    <w:lsdException w:name="HTML Preformatted" w:semiHidden="1" w:unhideWhenUsed="1"/>
-    <w:lsdException w:name="HTML Sample" w:semiHidden="1" w:unhideWhenUsed="1"/>
-    <w:lsdException w:name="HTML Typewriter" w:semiHidden="1" w:unhideWhenUsed="1"/>
-    <w:lsdException w:name="HTML Variable" w:semiHidden="1" w:unhideWhenUsed="1"/>
-    <w:lsdException w:name="Normal Table" w:semiHidden="1" w:unhideWhenUsed="1"/>
-    <w:lsdException w:name="annotation subject" w:semiHidden="1" w:unhideWhenUsed="1"/>
-    <w:lsdException w:name="No List" w:semiHidden="1" w:unhideWhenUsed="1"/>
-    <w:lsdException w:name="Outline List 1" w:semiHidden="1" w:unhideWhenUsed="1"/>
-    <w:lsdException w:name="Outline List 2" w:semiHidden="1" w:unhideWhenUsed="1"/>
-    <w:lsdException w:name="Outline List 3" w:semiHidden="1" w:unhideWhenUsed="1"/>
-    <w:lsdException w:name="Table Simple 1" w:semiHidden="1" w:unhideWhenUsed="1"/>
-    <w:lsdException w:name="Table Simple 2" w:semiHidden="1" w:unhideWhenUsed="1"/>
-    <w:lsdException w:name="Table Simple 3" w:semiHidden="1" w:unhideWhenUsed="1"/>
-    <w:lsdException w:name="Table Classic 1" w:semiHidden="1" w:unhideWhenUsed="1"/>
-    <w:lsdException w:name="Table Classic 2" w:semiHidden="1" w:unhideWhenUsed="1"/>
-    <w:lsdException w:name="Table Classic 3" w:semiHidden="1" w:unhideWhenUsed="1"/>
-    <w:lsdException w:name="Table Classic 4" w:semiHidden="1" w:unhideWhenUsed="1"/>
-    <w:lsdException w:name="Table Colorful 1" w:semiHidden="1" w:unhideWhenUsed="1"/>
-    <w:lsdException w:name="Table Colorful 2" w:semiHidden="1" w:unhideWhenUsed="1"/>
-    <w:lsdException w:name="Table Colorful 3" w:semiHidden="1" w:unhideWhenUsed="1"/>
-    <w:lsdException w:name="Table Columns 1" w:semiHidden="1" w:unhideWhenUsed="1"/>
-    <w:lsdException w:name="Table Columns 2" w:semiHidden="1" w:unhideWhenUsed="1"/>
-    <w:lsdException w:name="Table Columns 3" w:semiHidden="1" w:unhideWhenUsed="1"/>
-    <w:lsdException w:name="Table Columns 4" w:semiHidden="1" w:unhideWhenUsed="1"/>
-    <w:lsdException w:name="Table Columns 5" w:semiHidden="1" w:unhideWhenUsed="1"/>
-    <w:lsdException w:name="Table Grid 1" w:semiHidden="1" w:unhideWhenUsed="1"/>
-    <w:lsdException w:name="Table Grid 2" w:semiHidden="1" w:unhideWhenUsed="1"/>
-    <w:lsdException w:name="Table Grid 3" w:semiHidden="1" w:unhideWhenUsed="1"/>
-    <w:lsdException w:name="Table Grid 4" w:semiHidden="1" w:unhideWhenUsed="1"/>
-    <w:lsdException w:name="Table Grid 5" w:semiHidden="1" w:unhideWhenUsed="1"/>
-    <w:lsdException w:name="Table Grid 6" w:semiHidden="1" w:unhideWhenUsed="1"/>
-    <w:lsdException w:name="Table Grid 7" w:semiHidden="1" w:unhideWhenUsed="1"/>
-    <w:lsdException w:name="Table Grid 8" w:semiHidden="1" w:unhideWhenUsed="1"/>
-    <w:lsdException w:name="Table List 1" w:semiHidden="1" w:unhideWhenUsed="1"/>
-    <w:lsdException w:name="Table List 2" w:semiHidden="1" w:unhideWhenUsed="1"/>
-    <w:lsdException w:name="Table List 3" w:semiHidden="1" w:unhideWhenUsed="1"/>
-    <w:lsdException w:name="Table List 4" w:semiHidden="1" w:unhideWhenUsed="1"/>
-    <w:lsdException w:name="Table List 5" w:semiHidden="1" w:unhideWhenUsed="1"/>
-    <w:lsdException w:name="Table List 6" w:semiHidden="1" w:unhideWhenUsed="1"/>
-    <w:lsdException w:name="Table List 7" w:semiHidden="1" w:unhideWhenUsed="1"/>
-    <w:lsdException w:name="Table List 8" w:semiHidden="1" w:unhideWhenUsed="1"/>
-    <w:lsdException w:name="Table 3D effects 1" w:semiHidden="1" w:unhideWhenUsed="1"/>
-    <w:lsdException w:name="Table 3D effects 2" w:semiHidden="1" w:unhideWhenUsed="1"/>
-    <w:lsdException w:name="Table 3D effects 3" w:semiHidden="1" w:unhideWhenUsed="1"/>
-    <w:lsdException w:name="Table Contemporary" w:semiHidden="1" w:unhideWhenUsed="1"/>
-    <w:lsdException w:name="Table Elegant" w:semiHidden="1" w:unhideWhenUsed="1"/>
-    <w:lsdException w:name="Table Professional" w:semiHidden="1" w:unhideWhenUsed="1"/>
-    <w:lsdException w:name="Table Subtle 1" w:semiHidden="1" w:unhideWhenUsed="1"/>
-    <w:lsdException w:name="Table Subtle 2" w:semiHidden="1" w:unhideWhenUsed="1"/>
-    <w:lsdException w:name="Table Web 1" w:semiHidden="1" w:unhideWhenUsed="1"/>
-    <w:lsdException w:name="Table Web 2" w:semiHidden="1" w:unhideWhenUsed="1"/>
-    <w:lsdException w:name="Table Web 3" w:semiHidden="1" w:unhideWhenUsed="1"/>
-    <w:lsdException w:name="Balloon Text" w:semiHidden="1" w:unhideWhenUsed="1"/>
-    <w:lsdException w:name="Table Grid" w:uiPriority="39"/>
-    <w:lsdException w:name="Table Theme" w:semiHidden="1" w:unhideWhenUsed="1"/>
-    <w:lsdException w:name="Placeholder Text" w:semiHidden="1"/>
-    <w:lsdException w:name="No Spacing" w:qFormat="1" w:uiPriority="1"/>
-    <w:lsdException w:name="Light Shading" w:uiPriority="60"/>
-    <w:lsdException w:name="Light List" w:uiPriority="61"/>
-    <w:lsdException w:name="Light Grid" w:uiPriority="62"/>
-    <w:lsdException w:name="Medium Shading 1" w:uiPriority="63"/>
-    <w:lsdException w:name="Medium Shading 2" w:uiPriority="64"/>
-    <w:lsdException w:name="Medium List 1" w:uiPriority="65"/>
-    <w:lsdException w:name="Medium List 2" w:uiPriority="66"/>
-    <w:lsdException w:name="Medium Grid 1" w:uiPriority="67"/>
-    <w:lsdException w:name="Medium Grid 2" w:uiPriority="68"/>
-    <w:lsdException w:name="Medium Grid 3" w:uiPriority="69"/>
-    <w:lsdException w:name="Dark List" w:uiPriority="70"/>
-    <w:lsdException w:name="Colorful Shading" w:uiPriority="71"/>
-    <w:lsdException w:name="Colorful List" w:uiPriority="72"/>
-    <w:lsdException w:name="Colorful Grid" w:uiPriority="73"/>
-    <w:lsdException w:name="Light Shading Accent 1" w:uiPriority="60"/>
-    <w:lsdException w:name="Light List Accent 1" w:uiPriority="61"/>
-    <w:lsdException w:name="Light Grid Accent 1" w:uiPriority="62"/>
-    <w:lsdException w:name="Medium Shading 1 Accent 1" w:uiPriority="63"/>
-    <w:lsdException w:name="Medium Shading 2 Accent 1" w:uiPriority="64"/>
-    <w:lsdException w:name="Medium List 1 Accent 1" w:uiPriority="65"/>
-    <w:lsdException w:name="Revision" w:semiHidden="1"/>
-    <w:lsdException w:name="List Paragraph" w:qFormat="1" w:uiPriority="34"/>
-    <w:lsdException w:name="Quote" w:qFormat="1" w:uiPriority="29"/>
-    <w:lsdException w:name="Intense Quote" w:qFormat="1" w:uiPriority="30"/>
-    <w:lsdException w:name="Medium List 2 Accent 1" w:uiPriority="66"/>
-    <w:lsdException w:name="Medium Grid 1 Accent 1" w:uiPriority="67"/>
-    <w:lsdException w:name="Medium Grid 2 Accent 1" w:uiPriority="68"/>
-    <w:lsdException w:name="Medium Grid 3 Accent 1" w:uiPriority="69"/>
-    <w:lsdException w:name="Dark List Accent 1" w:uiPriority="70"/>
-    <w:lsdException w:name="Colorful Shading Accent 1" w:uiPriority="71"/>
-    <w:lsdException w:name="Colorful List Accent 1" w:uiPriority="72"/>
-    <w:lsdException w:name="Colorful Grid Accent 1" w:uiPriority="73"/>
-    <w:lsdException w:name="Light Shading Accent 2" w:uiPriority="60"/>
-    <w:lsdException w:name="Light List Accent 2" w:uiPriority="61"/>
-    <w:lsdException w:name="Light Grid Accent 2" w:uiPriority="62"/>
-    <w:lsdException w:name="Medium Shading 1 Accent 2" w:uiPriority="63"/>
-    <w:lsdException w:name="Medium Shading 2 Accent 2" w:uiPriority="64"/>
-    <w:lsdException w:name="Medium List 1 Accent 2" w:uiPriority="65"/>
-    <w:lsdException w:name="Medium List 2 Accent 2" w:uiPriority="66"/>
-    <w:lsdException w:name="Medium Grid 1 Accent 2" w:uiPriority="67"/>
-    <w:lsdException w:name="Medium Grid 2 Accent 2" w:uiPriority="68"/>
-    <w:lsdException w:name="Medium Grid 3 Accent 2" w:uiPriority="69"/>
-    <w:lsdException w:name="Dark List Accent 2" w:uiPriority="70"/>
-    <w:lsdException w:name="Colorful Shading Accent 2" w:uiPriority="71"/>
-    <w:lsdException w:name="Colorful List Accent 2" w:uiPriority="72"/>
-    <w:lsdException w:name="Colorful Grid Accent 2" w:uiPriority="73"/>
-    <w:lsdException w:name="Light Shading Accent 3" w:uiPriority="60"/>
-    <w:lsdException w:name="Light List Accent 3" w:uiPriority="61"/>
-    <w:lsdException w:name="Light Grid Accent 3" w:uiPriority="62"/>
-    <w:lsdException w:name="Medium Shading 1 Accent 3" w:uiPriority="63"/>
-    <w:lsdException w:name="Medium Shading 2 Accent 3" w:uiPriority="64"/>
-    <w:lsdException w:name="Medium List 1 Accent 3" w:uiPriority="65"/>
-    <w:lsdException w:name="Medium List 2 Accent 3" w:uiPriority="66"/>
-    <w:lsdException w:name="Medium Grid 1 Accent 3" w:uiPriority="67"/>
-    <w:lsdException w:name="Medium Grid 2 Accent 3" w:uiPriority="68"/>
-    <w:lsdException w:name="Medium Grid 3 Accent 3" w:uiPriority="69"/>
-    <w:lsdException w:name="Dark List Accent 3" w:uiPriority="70"/>
-    <w:lsdException w:name="Colorful Shading Accent 3" w:uiPriority="71"/>
-    <w:lsdException w:name="Colorful List Accent 3" w:uiPriority="72"/>
-    <w:lsdException w:name="Colorful Grid Accent 3" w:uiPriority="73"/>
-    <w:lsdException w:name="Light Shading Accent 4" w:uiPriority="60"/>
-    <w:lsdException w:name="Light List Accent 4" w:uiPriority="61"/>
-    <w:lsdException w:name="Light Grid Accent 4" w:uiPriority="62"/>
-    <w:lsdException w:name="Medium Shading 1 Accent 4" w:uiPriority="63"/>
-    <w:lsdException w:name="Medium Shading 2 Accent 4" w:uiPriority="64"/>
-    <w:lsdException w:name="Medium List 1 Accent 4" w:uiPriority="65"/>
-    <w:lsdException w:name="Medium List 2 Accent 4" w:uiPriority="66"/>
-    <w:lsdException w:name="Medium Grid 1 Accent 4" w:uiPriority="67"/>
-    <w:lsdException w:name="Medium Grid 2 Accent 4" w:uiPriority="68"/>
-    <w:lsdException w:name="Medium Grid 3 Accent 4" w:uiPriority="69"/>
-    <w:lsdException w:name="Dark List Accent 4" w:uiPriority="70"/>
-    <w:lsdException w:name="Colorful Shading Accent 4" w:uiPriority="71"/>
-    <w:lsdException w:name="Colorful List Accent 4" w:uiPriority="72"/>
-    <w:lsdException w:name="Colorful Grid Accent 4" w:uiPriority="73"/>
-    <w:lsdException w:name="Light Shading Accent 5" w:uiPriority="60"/>
-    <w:lsdException w:name="Light List Accent 5" w:uiPriority="61"/>
-    <w:lsdException w:name="Light Grid Accent 5" w:uiPriority="62"/>
-    <w:lsdException w:name="Medium Shading 1 Accent 5" w:uiPriority="63"/>
-    <w:lsdException w:name="Medium Shading 2 Accent 5" w:uiPriority="64"/>
-    <w:lsdException w:name="Medium List 1 Accent 5" w:uiPriority="65"/>
-    <w:lsdException w:name="Medium List 2 Accent 5" w:uiPriority="66"/>
-    <w:lsdException w:name="Medium Grid 1 Accent 5" w:uiPriority="67"/>
-    <w:lsdException w:name="Medium Grid 2 Accent 5" w:uiPriority="68"/>
-    <w:lsdException w:name="Medium Grid 3 Accent 5" w:uiPriority="69"/>
-    <w:lsdException w:name="Dark List Accent 5" w:uiPriority="70"/>
-    <w:lsdException w:name="Colorful Shading Accent 5" w:uiPriority="71"/>
-    <w:lsdException w:name="Colorful List Accent 5" w:uiPriority="72"/>
-    <w:lsdException w:name="Colorful Grid Accent 5" w:uiPriority="73"/>
-    <w:lsdException w:name="Light Shading Accent 6" w:uiPriority="60"/>
-    <w:lsdException w:name="Light List Accent 6" w:uiPriority="61"/>
-    <w:lsdException w:name="Light Grid Accent 6" w:uiPriority="62"/>
-    <w:lsdException w:name="Medium Shading 1 Accent 6" w:uiPriority="63"/>
-    <w:lsdException w:name="Medium Shading 2 Accent 6" w:uiPriority="64"/>
-    <w:lsdException w:name="Medium List 1 Accent 6" w:uiPriority="65"/>
-    <w:lsdException w:name="Medium List 2 Accent 6" w:uiPriority="66"/>
-    <w:lsdException w:name="Medium Grid 1 Accent 6" w:uiPriority="67"/>
-    <w:lsdException w:name="Medium Grid 2 Accent 6" w:uiPriority="68"/>
-    <w:lsdException w:name="Medium Grid 3 Accent 6" w:uiPriority="69"/>
-    <w:lsdException w:name="Dark List Accent 6" w:uiPriority="70"/>
-    <w:lsdException w:name="Colorful Shading Accent 6" w:uiPriority="71"/>
-    <w:lsdException w:name="Colorful List Accent 6" w:uiPriority="72"/>
-    <w:lsdException w:name="Colorful Grid Accent 6" w:uiPriority="73"/>
-    <w:lsdException w:name="Subtle Emphasis" w:qFormat="1" w:uiPriority="19"/>
-    <w:lsdException w:name="Intense Emphasis" w:qFormat="1" w:uiPriority="21"/>
-    <w:lsdException w:name="Subtle Reference" w:qFormat="1" w:uiPriority="31"/>
-    <w:lsdException w:name="Intense Reference" w:qFormat="1" w:uiPriority="32"/>
-    <w:lsdException w:name="Book Title" w:qFormat="1" w:uiPriority="33"/>
-    <w:lsdException w:name="Bibliography" w:semiHidden="1" w:uiPriority="37" w:unhideWhenUsed="1"/>
-    <w:lsdException w:name="TOC Heading" w:qFormat="1" w:semiHidden="1" w:uiPriority="39" w:unhideWhenUsed="1"/>
-    <w:lsdException w:name="Plain Table 1" w:uiPriority="41"/>
-    <w:lsdException w:name="Plain Table 2" w:uiPriority="42"/>
-    <w:lsdException w:name="Plain Table 3" w:uiPriority="43"/>
-    <w:lsdException w:name="Plain Table 4" w:uiPriority="44"/>
-    <w:lsdException w:name="Plain Table 5" w:uiPriority="45"/>
-    <w:lsdException w:name="Grid Table Light" w:uiPriority="40"/>
-    <w:lsdException w:name="Grid Table 1 Light" w:uiPriority="46"/>
-    <w:lsdException w:name="Grid Table 2" w:uiPriority="47"/>
-    <w:lsdException w:name="Grid Table 3" w:uiPriority="48"/>
-    <w:lsdException w:name="Grid Table 4" w:uiPriority="49"/>
-    <w:lsdException w:name="Grid Table 5 Dark" w:uiPriority="50"/>
-    <w:lsdException w:name="Grid Table 6 Colorful" w:uiPriority="51"/>
-    <w:lsdException w:name="Grid Table 7 Colorful" w:uiPriority="52"/>
-    <w:lsdException w:name="Grid Table 1 Light Accent 1" w:uiPriority="46"/>
-    <w:lsdException w:name="Grid Table 2 Accent 1" w:uiPriority="47"/>
-    <w:lsdException w:name="Grid Table 3 Accent 1" w:uiPriority="48"/>
-    <w:lsdException w:name="Grid Table 4 Accent 1" w:uiPriority="49"/>
-    <w:lsdException w:name="Grid Table 5 Dark Accent 1" w:uiPriority="50"/>
-    <w:lsdException w:name="Grid Table 6 Colorful Accent 1" w:uiPriority="51"/>
-    <w:lsdException w:name="Grid Table 7 Colorful Accent 1" w:uiPriority="52"/>
-    <w:lsdException w:name="Grid Table 1 Light Accent 2" w:uiPriority="46"/>
-    <w:lsdException w:name="Grid Table 2 Accent 2" w:uiPriority="47"/>
-    <w:lsdException w:name="Grid Table 3 Accent 2" w:uiPriority="48"/>
-    <w:lsdException w:name="Grid Table 4 Accent 2" w:uiPriority="49"/>
-    <w:lsdException w:name="Grid Table 5 Dark Accent 2" w:uiPriority="50"/>
-    <w:lsdException w:name="Grid Table 6 Colorful Accent 2" w:uiPriority="51"/>
-    <w:lsdException w:name="Grid Table 7 Colorful Accent 2" w:uiPriority="52"/>
-    <w:lsdException w:name="Grid Table 1 Light Accent 3" w:uiPriority="46"/>
-    <w:lsdException w:name="Grid Table 2 Accent 3" w:uiPriority="47"/>
-    <w:lsdException w:name="Grid Table 3 Accent 3" w:uiPriority="48"/>
-    <w:lsdException w:name="Grid Table 4 Accent 3" w:uiPriority="49"/>
-    <w:lsdException w:name="Grid Table 5 Dark Accent 3" w:uiPriority="50"/>
-    <w:lsdException w:name="Grid Table 6 Colorful Accent 3" w:uiPriority="51"/>
-    <w:lsdException w:name="Grid Table 7 Colorful Accent 3" w:uiPriority="52"/>
-    <w:lsdException w:name="Grid Table 1 Light Accent 4" w:uiPriority="46"/>
-    <w:lsdException w:name="Grid Table 2 Accent 4" w:uiPriority="47"/>
-    <w:lsdException w:name="Grid Table 3 Accent 4" w:uiPriority="48"/>
-    <w:lsdException w:name="Grid Table 4 Accent 4" w:uiPriority="49"/>
-    <w:lsdException w:name="Grid Table 5 Dark Accent 4" w:uiPriority="50"/>
-    <w:lsdException w:name="Grid Table 6 Colorful Accent 4" w:uiPriority="51"/>
-    <w:lsdException w:name="Grid Table 7 Colorful Accent 4" w:uiPriority="52"/>
-    <w:lsdException w:name="Grid Table 1 Light Accent 5" w:uiPriority="46"/>
-    <w:lsdException w:name="Grid Table 2 Accent 5" w:uiPriority="47"/>
-    <w:lsdException w:name="Grid Table 3 Accent 5" w:uiPriority="48"/>
-    <w:lsdException w:name="Grid Table 4 Accent 5" w:uiPriority="49"/>
-    <w:lsdException w:name="Grid Table 5 Dark Accent 5" w:uiPriority="50"/>
-    <w:lsdException w:name="Grid Table 6 Colorful Accent 5" w:uiPriority="51"/>
-    <w:lsdException w:name="Grid Table 7 Colorful Accent 5" w:uiPriority="52"/>
-    <w:lsdException w:name="Grid Table 1 Light Accent 6" w:uiPriority="46"/>
-    <w:lsdException w:name="Grid Table 2 Accent 6" w:uiPriority="47"/>
-    <w:lsdException w:name="Grid Table 3 Accent 6" w:uiPriority="48"/>
-    <w:lsdException w:name="Grid Table 4 Accent 6" w:uiPriority="49"/>
-    <w:lsdException w:name="Grid Table 5 Dark Accent 6" w:uiPriority="50"/>
-    <w:lsdException w:name="Grid Table 6 Colorful Accent 6" w:uiPriority="51"/>
-    <w:lsdException w:name="Grid Table 7 Colorful Accent 6" w:uiPriority="52"/>
-    <w:lsdException w:name="List Table 1 Light" w:uiPriority="46"/>
-    <w:lsdException w:name="List Table 2" w:uiPriority="47"/>
-    <w:lsdException w:name="List Table 3" w:uiPriority="48"/>
-    <w:lsdException w:name="List Table 4" w:uiPriority="49"/>
-    <w:lsdException w:name="List Table 5 Dark" w:uiPriority="50"/>
-    <w:lsdException w:name="List Table 6 Colorful" w:uiPriority="51"/>
-    <w:lsdException w:name="List Table 7 Colorful" w:uiPriority="52"/>
-    <w:lsdException w:name="List Table 1 Light Accent 1" w:uiPriority="46"/>
-    <w:lsdException w:name="List Table 2 Accent 1" w:uiPriority="47"/>
-    <w:lsdException w:name="List Table 3 Accent 1" w:uiPriority="48"/>
-    <w:lsdException w:name="List Table 4 Accent 1" w:uiPriority="49"/>
-    <w:lsdException w:name="List Table 5 Dark Accent 1" w:uiPriority="50"/>
-    <w:lsdException w:name="List Table 6 Colorful Accent 1" w:uiPriority="51"/>
-    <w:lsdException w:name="List Table 7 Colorful Accent 1" w:uiPriority="52"/>
-    <w:lsdException w:name="List Table 1 Light Accent 2" w:uiPriority="46"/>
-    <w:lsdException w:name="List Table 2 Accent 2" w:uiPriority="47"/>
-    <w:lsdException w:name="List Table 3 Accent 2" w:uiPriority="48"/>
-    <w:lsdException w:name="List Table 4 Accent 2" w:uiPriority="49"/>
-    <w:lsdException w:name="List Table 5 Dark Accent 2" w:uiPriority="50"/>
-    <w:lsdException w:name="List Table 6 Colorful Accent 2" w:uiPriority="51"/>
-    <w:lsdException w:name="List Table 7 Colorful Accent 2" w:uiPriority="52"/>
-    <w:lsdException w:name="List Table 1 Light Accent 3" w:uiPriority="46"/>
-    <w:lsdException w:name="List Table 2 Accent 3" w:uiPriority="47"/>
-    <w:lsdException w:name="List Table 3 Accent 3" w:uiPriority="48"/>
-    <w:lsdException w:name="List Table 4 Accent 3" w:uiPriority="49"/>
-    <w:lsdException w:name="List Table 5 Dark Accent 3" w:uiPriority="50"/>
-    <w:lsdException w:name="List Table 6 Colorful Accent 3" w:uiPriority="51"/>
-    <w:lsdException w:name="List Table 7 Colorful Accent 3" w:uiPriority="52"/>
-    <w:lsdException w:name="List Table 1 Light Accent 4" w:uiPriority="46"/>
-    <w:lsdException w:name="List Table 2 Accent 4" w:uiPriority="47"/>
-    <w:lsdException w:name="List Table 3 Accent 4" w:uiPriority="48"/>
-    <w:lsdException w:name="List Table 4 Accent 4" w:uiPriority="49"/>
-    <w:lsdException w:name="List Table 5 Dark Accent 4" w:uiPriority="50"/>
-    <w:lsdException w:name="List Table 6 Colorful Accent 4" w:uiPriority="51"/>
-    <w:lsdException w:name="List Table 7 Colorful Accent 4" w:uiPriority="52"/>
-    <w:lsdException w:name="List Table 1 Light Accent 5" w:uiPriority="46"/>
-    <w:lsdException w:name="List Table 2 Accent 5" w:uiPriority="47"/>
-    <w:lsdException w:name="List Table 3 Accent 5" w:uiPriority="48"/>
-    <w:lsdException w:name="List Table 4 Accent 5" w:uiPriority="49"/>
-    <w:lsdException w:name="List Table 5 Dark Accent 5" w:uiPriority="50"/>
-    <w:lsdException w:name="List Table 6 Colorful Accent 5" w:uiPriority="51"/>
-    <w:lsdException w:name="List Table 7 Colorful Accent 5" w:uiPriority="52"/>
-    <w:lsdException w:name="List Table 1 Light Accent 6" w:uiPriority="46"/>
-    <w:lsdException w:name="List Table 2 Accent 6" w:uiPriority="47"/>
-    <w:lsdException w:name="List Table 3 Accent 6" w:uiPriority="48"/>
-    <w:lsdException w:name="List Table 4 Accent 6" w:uiPriority="49"/>
-    <w:lsdException w:name="List Table 5 Dark Accent 6" w:uiPriority="50"/>
-    <w:lsdException w:name="List Table 6 Colorful Accent 6" w:uiPriority="51"/>
-    <w:lsdException w:name="List Table 7 Colorful Accent 6" w:uiPriority="52"/>
-    <w:lsdException w:name="Mention" w:semiHidden="1" w:unhideWhenUsed="1"/>
-    <w:lsdException w:name="Smart Hyperlink" w:semiHidden="1" w:unhideWhenUsed="1"/>
-    <w:lsdException w:name="Hashtag" w:semiHidden="1" w:unhideWhenUsed="1"/>
-    <w:lsdException w:name="Unresolved Mention" w:semiHidden="1" w:unhideWhenUsed="1"/>
-    <w:lsdException w:name="Smart Link" w:semiHidden="1" w:unhideWhenUsed="1"/>
-  </w:latentStyles>
-  <w:style w:default="1" w:styleId="Normln" w:type="paragraph">
+  <w:latentStyles w:count="276" w:defLockedState="0" w:defQFormat="0" w:defSemiHidden="0" w:defUIPriority="0" w:defUnhideWhenUsed="0"/>
+  <w:style w:default="1" w:styleId="Normal" w:type="paragraph">
     <w:name w:val="Normal"/>
     <w:qFormat/>
   </w:style>
-  <w:style w:styleId="Nadpis1" w:type="paragraph">
+  <w:style w:styleId="BodyText" w:type="paragraph">
+    <w:name w:val="Body Text"/>
+    <w:basedOn w:val="Normal"/>
+    <w:link w:val="BodyTextChar"/>
+    <w:qFormat/>
+    <w:pPr>
+      <w:spacing w:after="180" w:before="180"/>
+    </w:pPr>
+  </w:style>
+  <w:style w:customStyle="1" w:styleId="FirstParagraph" w:type="paragraph">
+    <w:name w:val="First Paragraph"/>
+    <w:basedOn w:val="BodyText"/>
+    <w:next w:val="BodyText"/>
+    <w:qFormat/>
+  </w:style>
+  <w:style w:customStyle="1" w:styleId="Compact" w:type="paragraph">
+    <w:name w:val="Compact"/>
+    <w:basedOn w:val="BodyText"/>
+    <w:qFormat/>
+    <w:pPr>
+      <w:spacing w:after="36" w:before="36"/>
+    </w:pPr>
+  </w:style>
+  <w:style w:styleId="Title" w:type="paragraph">
+    <w:name w:val="Title"/>
+    <w:basedOn w:val="Normal"/>
+    <w:next w:val="BodyText"/>
+    <w:link w:val="TitleChar"/>
+    <w:uiPriority w:val="10"/>
+    <w:qFormat/>
+    <w:rsid w:val="00A10FD9"/>
+    <w:pPr>
+      <w:spacing w:after="80" w:line="240" w:lineRule="auto"/>
+      <w:contextualSpacing/>
+      <w:jc w:val="center"/>
+    </w:pPr>
+    <w:rPr>
+      <w:rFonts w:asciiTheme="majorHAnsi" w:cstheme="majorBidi" w:eastAsiaTheme="majorEastAsia" w:hAnsiTheme="majorHAnsi"/>
+      <w:sz w:val="56"/>
+      <w:szCs w:val="56"/>
+    </w:rPr>
+  </w:style>
+  <w:style w:customStyle="1" w:styleId="TitleChar" w:type="character">
+    <w:name w:val="Title Char"/>
+    <w:basedOn w:val="DefaultParagraphFont"/>
+    <w:link w:val="Title"/>
+    <w:uiPriority w:val="10"/>
+    <w:rsid w:val="00A10FD9"/>
+    <w:rPr>
+      <w:rFonts w:asciiTheme="majorHAnsi" w:cstheme="majorBidi" w:eastAsiaTheme="majorEastAsia" w:hAnsiTheme="majorHAnsi"/>
+      <w:sz w:val="56"/>
+      <w:szCs w:val="56"/>
+    </w:rPr>
+  </w:style>
+  <w:style w:styleId="Subtitle" w:type="paragraph">
+    <w:name w:val="Subtitle"/>
+    <w:basedOn w:val="Title"/>
+    <w:next w:val="BodyText"/>
+    <w:link w:val="SubtitleChar"/>
+    <w:uiPriority w:val="11"/>
+    <w:qFormat/>
+    <w:rsid w:val="00A10FD9"/>
+    <w:pPr>
+      <w:numPr>
+        <w:ilvl w:val="1"/>
+      </w:numPr>
+    </w:pPr>
+    <w:rPr>
+      <w:rFonts w:cstheme="majorBidi" w:eastAsiaTheme="majorEastAsia"/>
+      <w:spacing w:val="15"/>
+      <w:sz w:val="28"/>
+      <w:szCs w:val="28"/>
+    </w:rPr>
+  </w:style>
+  <w:style w:customStyle="1" w:styleId="SubtitleChar" w:type="character">
+    <w:name w:val="Subtitle Char"/>
+    <w:basedOn w:val="DefaultParagraphFont"/>
+    <w:link w:val="Subtitle"/>
+    <w:uiPriority w:val="11"/>
+    <w:rsid w:val="00A10FD9"/>
+    <w:rPr>
+      <w:rFonts w:cstheme="majorBidi" w:eastAsiaTheme="majorEastAsia"/>
+      <w:color w:themeColor="text1" w:themeTint="A6" w:val="595959"/>
+      <w:spacing w:val="15"/>
+      <w:sz w:val="28"/>
+      <w:szCs w:val="28"/>
+    </w:rPr>
+  </w:style>
+  <w:style w:customStyle="1" w:styleId="Author" w:type="paragraph">
+    <w:name w:val="Author"/>
+    <w:basedOn w:val="Title"/>
+    <w:next w:val="BodyText"/>
+    <w:qFormat/>
+    <w:pPr>
+      <w:keepNext/>
+      <w:keepLines/>
+    </w:pPr>
+    <w:rPr>
+      <w:sz w:val="24"/>
+      <w:szCs w:val="24"/>
+    </w:rPr>
+  </w:style>
+  <w:style w:styleId="Date" w:type="paragraph">
+    <w:name w:val="Date"/>
+    <w:basedOn w:val="Title"/>
+    <w:next w:val="BodyText"/>
+    <w:qFormat/>
+    <w:pPr>
+      <w:keepNext/>
+      <w:keepLines/>
+    </w:pPr>
+    <w:rPr>
+      <w:sz w:val="24"/>
+      <w:szCs w:val="24"/>
+    </w:rPr>
+  </w:style>
+  <w:style w:customStyle="1" w:styleId="AbstractTitle" w:type="paragraph">
+    <w:name w:val="Abstract Title"/>
+    <w:basedOn w:val="Normal"/>
+    <w:next w:val="Abstract"/>
+    <w:qFormat/>
+    <w:pPr>
+      <w:keepNext/>
+      <w:keepLines/>
+      <w:spacing w:after="0" w:before="300"/>
+      <w:jc w:val="center"/>
+    </w:pPr>
+    <w:rPr>
+      <w:b/>
+      <w:sz w:val="20"/>
+      <w:szCs w:val="20"/>
+    </w:rPr>
+  </w:style>
+  <w:style w:customStyle="1" w:styleId="Abstract" w:type="paragraph">
+    <w:name w:val="Abstract"/>
+    <w:basedOn w:val="Normal"/>
+    <w:next w:val="BodyText"/>
+    <w:qFormat/>
+    <w:pPr>
+      <w:keepNext/>
+      <w:keepLines/>
+      <w:spacing w:after="300" w:before="100"/>
+    </w:pPr>
+    <w:rPr>
+      <w:sz w:val="20"/>
+      <w:szCs w:val="20"/>
+    </w:rPr>
+  </w:style>
+  <w:style w:styleId="Bibliography" w:type="paragraph">
+    <w:name w:val="Bibliography"/>
+    <w:basedOn w:val="Normal"/>
+    <w:next w:val="Bibliography"/>
+    <w:qFormat/>
+    <w:pPr/>
+    <w:rPr/>
+  </w:style>
+  <w:style w:styleId="Heading1" w:type="paragraph">
     <w:name w:val="heading 1"/>
-    <w:basedOn w:val="Normln"/>
-    <w:next w:val="Normln"/>
-    <w:link w:val="Nadpis1Char"/>
+    <w:basedOn w:val="Normal"/>
+    <w:next w:val="BodyText"/>
+    <w:link w:val="Heading1Char"/>
     <w:uiPriority w:val="9"/>
     <w:qFormat/>
-    <w:rsid w:val="00885B96"/>
+    <w:rsid w:val="00A10FD9"/>
     <w:pPr>
       <w:keepNext/>
       <w:keepLines/>
@@ -1248,15 +1025,16 @@
       <w:szCs w:val="40"/>
     </w:rPr>
   </w:style>
-  <w:style w:styleId="Nadpis2" w:type="paragraph">
+  <w:style w:styleId="Heading2" w:type="paragraph">
     <w:name w:val="heading 2"/>
-    <w:basedOn w:val="Normln"/>
-    <w:next w:val="Normln"/>
-    <w:link w:val="Nadpis2Char"/>
+    <w:basedOn w:val="Normal"/>
+    <w:next w:val="BodyText"/>
+    <w:link w:val="Heading2Char"/>
     <w:uiPriority w:val="9"/>
+    <w:semiHidden/>
     <w:unhideWhenUsed/>
     <w:qFormat/>
-    <w:rsid w:val="00885B96"/>
+    <w:rsid w:val="00A10FD9"/>
     <w:pPr>
       <w:keepNext/>
       <w:keepLines/>
@@ -1270,15 +1048,16 @@
       <w:szCs w:val="32"/>
     </w:rPr>
   </w:style>
-  <w:style w:styleId="Nadpis3" w:type="paragraph">
+  <w:style w:styleId="Heading3" w:type="paragraph">
     <w:name w:val="heading 3"/>
-    <w:basedOn w:val="Normln"/>
-    <w:next w:val="Normln"/>
-    <w:link w:val="Nadpis3Char"/>
+    <w:basedOn w:val="Normal"/>
+    <w:next w:val="BodyText"/>
+    <w:link w:val="Heading3Char"/>
     <w:uiPriority w:val="9"/>
+    <w:semiHidden/>
     <w:unhideWhenUsed/>
     <w:qFormat/>
-    <w:rsid w:val="00885B96"/>
+    <w:rsid w:val="00A10FD9"/>
     <w:pPr>
       <w:keepNext/>
       <w:keepLines/>
@@ -1292,15 +1071,16 @@
       <w:szCs w:val="28"/>
     </w:rPr>
   </w:style>
-  <w:style w:styleId="Nadpis4" w:type="paragraph">
+  <w:style w:styleId="Heading4" w:type="paragraph">
     <w:name w:val="heading 4"/>
-    <w:basedOn w:val="Normln"/>
-    <w:next w:val="Normln"/>
-    <w:link w:val="Nadpis4Char"/>
+    <w:basedOn w:val="Normal"/>
+    <w:next w:val="BodyText"/>
+    <w:link w:val="Heading4Char"/>
     <w:uiPriority w:val="9"/>
+    <w:semiHidden/>
     <w:unhideWhenUsed/>
     <w:qFormat/>
-    <w:rsid w:val="00885B96"/>
+    <w:rsid w:val="00A10FD9"/>
     <w:pPr>
       <w:keepNext/>
       <w:keepLines/>
@@ -1314,16 +1094,16 @@
       <w:color w:themeColor="accent1" w:themeShade="BF" w:val="0F4761"/>
     </w:rPr>
   </w:style>
-  <w:style w:styleId="Nadpis5" w:type="paragraph">
+  <w:style w:styleId="Heading5" w:type="paragraph">
     <w:name w:val="heading 5"/>
-    <w:basedOn w:val="Normln"/>
-    <w:next w:val="Normln"/>
-    <w:link w:val="Nadpis5Char"/>
+    <w:basedOn w:val="Normal"/>
+    <w:next w:val="BodyText"/>
+    <w:link w:val="Heading5Char"/>
     <w:uiPriority w:val="9"/>
     <w:semiHidden/>
     <w:unhideWhenUsed/>
     <w:qFormat/>
-    <w:rsid w:val="00885B96"/>
+    <w:rsid w:val="00A10FD9"/>
     <w:pPr>
       <w:keepNext/>
       <w:keepLines/>
@@ -1335,16 +1115,16 @@
       <w:color w:themeColor="accent1" w:themeShade="BF" w:val="0F4761"/>
     </w:rPr>
   </w:style>
-  <w:style w:styleId="Nadpis6" w:type="paragraph">
+  <w:style w:styleId="Heading6" w:type="paragraph">
     <w:name w:val="heading 6"/>
-    <w:basedOn w:val="Normln"/>
-    <w:next w:val="Normln"/>
-    <w:link w:val="Nadpis6Char"/>
+    <w:basedOn w:val="Normal"/>
+    <w:next w:val="BodyText"/>
+    <w:link w:val="Heading6Char"/>
     <w:uiPriority w:val="9"/>
     <w:semiHidden/>
     <w:unhideWhenUsed/>
     <w:qFormat/>
-    <w:rsid w:val="00885B96"/>
+    <w:rsid w:val="00A10FD9"/>
     <w:pPr>
       <w:keepNext/>
       <w:keepLines/>
@@ -1358,16 +1138,16 @@
       <w:color w:themeColor="text1" w:themeTint="A6" w:val="595959"/>
     </w:rPr>
   </w:style>
-  <w:style w:styleId="Nadpis7" w:type="paragraph">
+  <w:style w:styleId="Heading7" w:type="paragraph">
     <w:name w:val="heading 7"/>
-    <w:basedOn w:val="Normln"/>
-    <w:next w:val="Normln"/>
-    <w:link w:val="Nadpis7Char"/>
+    <w:basedOn w:val="Normal"/>
+    <w:next w:val="BodyText"/>
+    <w:link w:val="Heading7Char"/>
     <w:uiPriority w:val="9"/>
     <w:semiHidden/>
     <w:unhideWhenUsed/>
     <w:qFormat/>
-    <w:rsid w:val="00885B96"/>
+    <w:rsid w:val="00A10FD9"/>
     <w:pPr>
       <w:keepNext/>
       <w:keepLines/>
@@ -1379,16 +1159,16 @@
       <w:color w:themeColor="text1" w:themeTint="A6" w:val="595959"/>
     </w:rPr>
   </w:style>
-  <w:style w:styleId="Nadpis8" w:type="paragraph">
+  <w:style w:styleId="Heading8" w:type="paragraph">
     <w:name w:val="heading 8"/>
-    <w:basedOn w:val="Normln"/>
-    <w:next w:val="Normln"/>
-    <w:link w:val="Nadpis8Char"/>
+    <w:basedOn w:val="Normal"/>
+    <w:next w:val="BodyText"/>
+    <w:link w:val="Heading8Char"/>
     <w:uiPriority w:val="9"/>
     <w:semiHidden/>
     <w:unhideWhenUsed/>
     <w:qFormat/>
-    <w:rsid w:val="00885B96"/>
+    <w:rsid w:val="00A10FD9"/>
     <w:pPr>
       <w:keepNext/>
       <w:keepLines/>
@@ -1402,16 +1182,16 @@
       <w:color w:themeColor="text1" w:themeTint="D8" w:val="272727"/>
     </w:rPr>
   </w:style>
-  <w:style w:styleId="Nadpis9" w:type="paragraph">
+  <w:style w:styleId="Heading9" w:type="paragraph">
     <w:name w:val="heading 9"/>
-    <w:basedOn w:val="Normln"/>
-    <w:next w:val="Normln"/>
-    <w:link w:val="Nadpis9Char"/>
+    <w:basedOn w:val="Normal"/>
+    <w:next w:val="BodyText"/>
+    <w:link w:val="Heading9Char"/>
     <w:uiPriority w:val="9"/>
     <w:semiHidden/>
     <w:unhideWhenUsed/>
     <w:qFormat/>
-    <w:rsid w:val="00885B96"/>
+    <w:rsid w:val="00A10FD9"/>
     <w:pPr>
       <w:keepNext/>
       <w:keepLines/>
@@ -1423,17 +1203,168 @@
       <w:color w:themeColor="text1" w:themeTint="D8" w:val="272727"/>
     </w:rPr>
   </w:style>
-  <w:style w:default="1" w:styleId="Standardnpsmoodstavce" w:type="character">
+  <w:style w:customStyle="1" w:styleId="Heading1Char" w:type="character">
+    <w:name w:val="Heading 1 Char"/>
+    <w:basedOn w:val="DefaultParagraphFont"/>
+    <w:link w:val="Heading1"/>
+    <w:uiPriority w:val="9"/>
+    <w:rsid w:val="00A10FD9"/>
+    <w:rPr>
+      <w:rFonts w:asciiTheme="majorHAnsi" w:cstheme="majorBidi" w:eastAsiaTheme="majorEastAsia" w:hAnsiTheme="majorHAnsi"/>
+      <w:color w:themeColor="accent1" w:themeShade="BF" w:val="0F4761"/>
+      <w:sz w:val="40"/>
+      <w:szCs w:val="40"/>
+    </w:rPr>
+  </w:style>
+  <w:style w:customStyle="1" w:styleId="Heading2Char" w:type="character">
+    <w:name w:val="Heading 2 Char"/>
+    <w:basedOn w:val="DefaultParagraphFont"/>
+    <w:link w:val="Heading2"/>
+    <w:uiPriority w:val="9"/>
+    <w:semiHidden/>
+    <w:rsid w:val="00A10FD9"/>
+    <w:rPr>
+      <w:rFonts w:asciiTheme="majorHAnsi" w:cstheme="majorBidi" w:eastAsiaTheme="majorEastAsia" w:hAnsiTheme="majorHAnsi"/>
+      <w:color w:themeColor="accent1" w:themeShade="BF" w:val="0F4761"/>
+      <w:sz w:val="32"/>
+      <w:szCs w:val="32"/>
+    </w:rPr>
+  </w:style>
+  <w:style w:customStyle="1" w:styleId="Heading3Char" w:type="character">
+    <w:name w:val="Heading 3 Char"/>
+    <w:basedOn w:val="DefaultParagraphFont"/>
+    <w:link w:val="Heading3"/>
+    <w:uiPriority w:val="9"/>
+    <w:semiHidden/>
+    <w:rsid w:val="00A10FD9"/>
+    <w:rPr>
+      <w:rFonts w:cstheme="majorBidi" w:eastAsiaTheme="majorEastAsia"/>
+      <w:color w:themeColor="accent1" w:themeShade="BF" w:val="0F4761"/>
+      <w:sz w:val="28"/>
+      <w:szCs w:val="28"/>
+    </w:rPr>
+  </w:style>
+  <w:style w:customStyle="1" w:styleId="Heading4Char" w:type="character">
+    <w:name w:val="Heading 4 Char"/>
+    <w:basedOn w:val="DefaultParagraphFont"/>
+    <w:link w:val="Heading4"/>
+    <w:uiPriority w:val="9"/>
+    <w:semiHidden/>
+    <w:rsid w:val="00A10FD9"/>
+    <w:rPr>
+      <w:rFonts w:cstheme="majorBidi" w:eastAsiaTheme="majorEastAsia"/>
+      <w:i/>
+      <w:iCs/>
+      <w:color w:themeColor="accent1" w:themeShade="BF" w:val="0F4761"/>
+    </w:rPr>
+  </w:style>
+  <w:style w:customStyle="1" w:styleId="Heading5Char" w:type="character">
+    <w:name w:val="Heading 5 Char"/>
+    <w:basedOn w:val="DefaultParagraphFont"/>
+    <w:link w:val="Heading5"/>
+    <w:uiPriority w:val="9"/>
+    <w:semiHidden/>
+    <w:rsid w:val="00A10FD9"/>
+    <w:rPr>
+      <w:rFonts w:cstheme="majorBidi" w:eastAsiaTheme="majorEastAsia"/>
+      <w:color w:themeColor="accent1" w:themeShade="BF" w:val="0F4761"/>
+    </w:rPr>
+  </w:style>
+  <w:style w:customStyle="1" w:styleId="Heading6Char" w:type="character">
+    <w:name w:val="Heading 6 Char"/>
+    <w:basedOn w:val="DefaultParagraphFont"/>
+    <w:link w:val="Heading6"/>
+    <w:uiPriority w:val="9"/>
+    <w:semiHidden/>
+    <w:rsid w:val="00A10FD9"/>
+    <w:rPr>
+      <w:rFonts w:cstheme="majorBidi" w:eastAsiaTheme="majorEastAsia"/>
+      <w:i/>
+      <w:iCs/>
+      <w:color w:themeColor="text1" w:themeTint="A6" w:val="595959"/>
+    </w:rPr>
+  </w:style>
+  <w:style w:customStyle="1" w:styleId="Heading7Char" w:type="character">
+    <w:name w:val="Heading 7 Char"/>
+    <w:basedOn w:val="DefaultParagraphFont"/>
+    <w:link w:val="Heading7"/>
+    <w:uiPriority w:val="9"/>
+    <w:semiHidden/>
+    <w:rsid w:val="00A10FD9"/>
+    <w:rPr>
+      <w:rFonts w:cstheme="majorBidi" w:eastAsiaTheme="majorEastAsia"/>
+      <w:color w:themeColor="text1" w:themeTint="A6" w:val="595959"/>
+    </w:rPr>
+  </w:style>
+  <w:style w:customStyle="1" w:styleId="Heading8Char" w:type="character">
+    <w:name w:val="Heading 8 Char"/>
+    <w:basedOn w:val="DefaultParagraphFont"/>
+    <w:link w:val="Heading8"/>
+    <w:uiPriority w:val="9"/>
+    <w:semiHidden/>
+    <w:rsid w:val="00A10FD9"/>
+    <w:rPr>
+      <w:rFonts w:cstheme="majorBidi" w:eastAsiaTheme="majorEastAsia"/>
+      <w:i/>
+      <w:iCs/>
+      <w:color w:themeColor="text1" w:themeTint="D8" w:val="272727"/>
+    </w:rPr>
+  </w:style>
+  <w:style w:customStyle="1" w:styleId="Heading9Char" w:type="character">
+    <w:name w:val="Heading 9 Char"/>
+    <w:basedOn w:val="DefaultParagraphFont"/>
+    <w:link w:val="Heading9"/>
+    <w:uiPriority w:val="9"/>
+    <w:semiHidden/>
+    <w:rsid w:val="00A10FD9"/>
+    <w:rPr>
+      <w:rFonts w:cstheme="majorBidi" w:eastAsiaTheme="majorEastAsia"/>
+      <w:color w:themeColor="text1" w:themeTint="D8" w:val="272727"/>
+    </w:rPr>
+  </w:style>
+  <w:style w:styleId="BlockText" w:type="paragraph">
+    <w:name w:val="Block Text"/>
+    <w:basedOn w:val="BodyText"/>
+    <w:next w:val="BodyText"/>
+    <w:uiPriority w:val="9"/>
+    <w:unhideWhenUsed/>
+    <w:qFormat/>
+    <w:pPr>
+      <w:spacing w:after="100" w:before="100"/>
+      <w:ind w:firstLine="0" w:left="480" w:right="480"/>
+    </w:pPr>
+  </w:style>
+  <w:style w:styleId="FootnoteText" w:type="paragraph">
+    <w:name w:val="Footnote Text"/>
+    <w:basedOn w:val="Normal"/>
+    <w:next w:val="FootnoteText"/>
+    <w:uiPriority w:val="9"/>
+    <w:unhideWhenUsed/>
+    <w:qFormat/>
+  </w:style>
+  <w:style w:styleId="FootnoteBlockText" w:type="paragraph">
+    <w:name w:val="Footnote Block Text"/>
+    <w:basedOn w:val="FootnoteText"/>
+    <w:next w:val="FootnoteText"/>
+    <w:uiPriority w:val="9"/>
+    <w:unhideWhenUsed/>
+    <w:qFormat/>
+    <w:pPr>
+      <w:spacing w:after="100" w:before="100"/>
+      <w:ind w:firstLine="0" w:left="480" w:right="480"/>
+    </w:pPr>
+  </w:style>
+  <w:style w:default="1" w:styleId="DefaultParagraphFont" w:type="character">
     <w:name w:val="Default Paragraph Font"/>
-    <w:uiPriority w:val="1"/>
     <w:semiHidden/>
     <w:unhideWhenUsed/>
   </w:style>
-  <w:style w:default="1" w:styleId="Normlntabulka" w:type="table">
-    <w:name w:val="Normal Table"/>
-    <w:uiPriority w:val="99"/>
+  <w:style w:default="1" w:styleId="Table" w:type="table">
+    <w:name w:val="Table"/>
+    <w:basedOn w:val="TableNormal"/>
     <w:semiHidden/>
     <w:unhideWhenUsed/>
+    <w:qFormat/>
     <w:tblPr>
       <w:tblInd w:type="dxa" w:w="0"/>
       <w:tblCellMar>
@@ -1443,298 +1374,112 @@
         <w:right w:type="dxa" w:w="108"/>
       </w:tblCellMar>
     </w:tblPr>
-  </w:style>
-  <w:style w:default="1" w:styleId="Bezseznamu" w:type="numbering">
-    <w:name w:val="No List"/>
-    <w:uiPriority w:val="99"/>
-    <w:semiHidden/>
+    <w:tblStylePr w:type="firstRow">
+      <w:tcPr>
+        <w:tcBorders>
+          <w:bottom w:val="single"/>
+        </w:tcBorders>
+        <w:vAlign w:val="bottom"/>
+      </w:tcPr>
+    </w:tblStylePr>
+  </w:style>
+  <w:style w:customStyle="1" w:styleId="DefinitionTerm" w:type="paragraph">
+    <w:name w:val="Definition Term"/>
+    <w:basedOn w:val="Normal"/>
+    <w:next w:val="Definition"/>
+    <w:pPr>
+      <w:keepNext/>
+      <w:keepLines/>
+      <w:spacing w:after="0"/>
+    </w:pPr>
+    <w:rPr>
+      <w:b/>
+    </w:rPr>
+  </w:style>
+  <w:style w:customStyle="1" w:styleId="Definition" w:type="paragraph">
+    <w:name w:val="Definition"/>
+    <w:basedOn w:val="Normal"/>
+  </w:style>
+  <w:style w:styleId="Caption" w:type="paragraph">
+    <w:name w:val="Caption"/>
+    <w:basedOn w:val="Normal"/>
+    <w:link w:val="BodyTextChar"/>
+    <w:pPr>
+      <w:spacing w:after="120" w:before="0"/>
+    </w:pPr>
+    <w:rPr>
+      <w:i/>
+    </w:rPr>
+  </w:style>
+  <w:style w:customStyle="1" w:styleId="TableCaption" w:type="paragraph">
+    <w:name w:val="Table Caption"/>
+    <w:basedOn w:val="Caption"/>
+    <w:pPr>
+      <w:keepNext/>
+    </w:pPr>
+  </w:style>
+  <w:style w:customStyle="1" w:styleId="ImageCaption" w:type="paragraph">
+    <w:name w:val="Image Caption"/>
+    <w:basedOn w:val="Caption"/>
+  </w:style>
+  <w:style w:customStyle="1" w:styleId="Figure" w:type="paragraph">
+    <w:name w:val="Figure"/>
+    <w:basedOn w:val="Normal"/>
+  </w:style>
+  <w:style w:customStyle="1" w:styleId="CaptionedFigure" w:type="paragraph">
+    <w:name w:val="Captioned Figure"/>
+    <w:basedOn w:val="Figure"/>
+    <w:pPr>
+      <w:keepNext/>
+    </w:pPr>
+  </w:style>
+  <w:style w:customStyle="1" w:styleId="BodyTextChar" w:type="character">
+    <w:name w:val="Body Text Char"/>
+    <w:basedOn w:val="DefaultParagraphFont"/>
+    <w:link w:val="BodyText"/>
+  </w:style>
+  <w:style w:customStyle="1" w:styleId="VerbatimChar" w:type="character">
+    <w:name w:val="Verbatim Char"/>
+    <w:basedOn w:val="BodyTextChar"/>
+    <w:rPr>
+      <w:rFonts w:ascii="Consolas" w:hAnsi="Consolas"/>
+      <w:sz w:val="22"/>
+    </w:rPr>
+  </w:style>
+  <w:style w:customStyle="1" w:styleId="SectionNumber" w:type="character">
+    <w:name w:val="Section Number"/>
+    <w:basedOn w:val="BodyTextChar"/>
+  </w:style>
+  <w:style w:styleId="FootnoteReference" w:type="character">
+    <w:name w:val="Footnote Reference"/>
+    <w:basedOn w:val="BodyTextChar"/>
+    <w:rPr>
+      <w:vertAlign w:val="superscript"/>
+    </w:rPr>
+  </w:style>
+  <w:style w:styleId="Hyperlink" w:type="character">
+    <w:name w:val="Hyperlink"/>
+    <w:basedOn w:val="BodyTextChar"/>
+    <w:rPr>
+      <w:color w:themeColor="accent1" w:val="4F81BD"/>
+    </w:rPr>
+  </w:style>
+  <w:style w:styleId="TOCHeading" w:type="paragraph">
+    <w:name w:val="TOC Heading"/>
+    <w:basedOn w:val="Heading1"/>
+    <w:next w:val="BodyText"/>
+    <w:uiPriority w:val="39"/>
     <w:unhideWhenUsed/>
-  </w:style>
-  <w:style w:customStyle="1" w:styleId="Nadpis1Char" w:type="character">
-    <w:name w:val="Nadpis 1 Char"/>
-    <w:basedOn w:val="Standardnpsmoodstavce"/>
-    <w:link w:val="Nadpis1"/>
-    <w:uiPriority w:val="9"/>
-    <w:rsid w:val="00885B96"/>
+    <w:qFormat/>
+    <w:pPr>
+      <w:spacing w:before="240" w:line="259" w:lineRule="auto"/>
+      <w:outlineLvl w:val="9"/>
+    </w:pPr>
     <w:rPr>
       <w:rFonts w:asciiTheme="majorHAnsi" w:cstheme="majorBidi" w:eastAsiaTheme="majorEastAsia" w:hAnsiTheme="majorHAnsi"/>
-      <w:color w:themeColor="accent1" w:themeShade="BF" w:val="0F4761"/>
-      <w:sz w:val="40"/>
-      <w:szCs w:val="40"/>
-    </w:rPr>
-  </w:style>
-  <w:style w:customStyle="1" w:styleId="Nadpis2Char" w:type="character">
-    <w:name w:val="Nadpis 2 Char"/>
-    <w:basedOn w:val="Standardnpsmoodstavce"/>
-    <w:link w:val="Nadpis2"/>
-    <w:uiPriority w:val="9"/>
-    <w:rsid w:val="00885B96"/>
-    <w:rPr>
-      <w:rFonts w:asciiTheme="majorHAnsi" w:cstheme="majorBidi" w:eastAsiaTheme="majorEastAsia" w:hAnsiTheme="majorHAnsi"/>
-      <w:color w:themeColor="accent1" w:themeShade="BF" w:val="0F4761"/>
-      <w:sz w:val="32"/>
-      <w:szCs w:val="32"/>
-    </w:rPr>
-  </w:style>
-  <w:style w:customStyle="1" w:styleId="Nadpis3Char" w:type="character">
-    <w:name w:val="Nadpis 3 Char"/>
-    <w:basedOn w:val="Standardnpsmoodstavce"/>
-    <w:link w:val="Nadpis3"/>
-    <w:uiPriority w:val="9"/>
-    <w:rsid w:val="00885B96"/>
-    <w:rPr>
-      <w:rFonts w:cstheme="majorBidi" w:eastAsiaTheme="majorEastAsia"/>
-      <w:color w:themeColor="accent1" w:themeShade="BF" w:val="0F4761"/>
-      <w:sz w:val="28"/>
-      <w:szCs w:val="28"/>
-    </w:rPr>
-  </w:style>
-  <w:style w:customStyle="1" w:styleId="Nadpis4Char" w:type="character">
-    <w:name w:val="Nadpis 4 Char"/>
-    <w:basedOn w:val="Standardnpsmoodstavce"/>
-    <w:link w:val="Nadpis4"/>
-    <w:uiPriority w:val="9"/>
-    <w:rsid w:val="00885B96"/>
-    <w:rPr>
-      <w:rFonts w:cstheme="majorBidi" w:eastAsiaTheme="majorEastAsia"/>
-      <w:i/>
-      <w:iCs/>
-      <w:color w:themeColor="accent1" w:themeShade="BF" w:val="0F4761"/>
-    </w:rPr>
-  </w:style>
-  <w:style w:customStyle="1" w:styleId="Nadpis5Char" w:type="character">
-    <w:name w:val="Nadpis 5 Char"/>
-    <w:basedOn w:val="Standardnpsmoodstavce"/>
-    <w:link w:val="Nadpis5"/>
-    <w:uiPriority w:val="9"/>
-    <w:semiHidden/>
-    <w:rsid w:val="00885B96"/>
-    <w:rPr>
-      <w:rFonts w:cstheme="majorBidi" w:eastAsiaTheme="majorEastAsia"/>
-      <w:color w:themeColor="accent1" w:themeShade="BF" w:val="0F4761"/>
-    </w:rPr>
-  </w:style>
-  <w:style w:customStyle="1" w:styleId="Nadpis6Char" w:type="character">
-    <w:name w:val="Nadpis 6 Char"/>
-    <w:basedOn w:val="Standardnpsmoodstavce"/>
-    <w:link w:val="Nadpis6"/>
-    <w:uiPriority w:val="9"/>
-    <w:semiHidden/>
-    <w:rsid w:val="00885B96"/>
-    <w:rPr>
-      <w:rFonts w:cstheme="majorBidi" w:eastAsiaTheme="majorEastAsia"/>
-      <w:i/>
-      <w:iCs/>
-      <w:color w:themeColor="text1" w:themeTint="A6" w:val="595959"/>
-    </w:rPr>
-  </w:style>
-  <w:style w:customStyle="1" w:styleId="Nadpis7Char" w:type="character">
-    <w:name w:val="Nadpis 7 Char"/>
-    <w:basedOn w:val="Standardnpsmoodstavce"/>
-    <w:link w:val="Nadpis7"/>
-    <w:uiPriority w:val="9"/>
-    <w:semiHidden/>
-    <w:rsid w:val="00885B96"/>
-    <w:rPr>
-      <w:rFonts w:cstheme="majorBidi" w:eastAsiaTheme="majorEastAsia"/>
-      <w:color w:themeColor="text1" w:themeTint="A6" w:val="595959"/>
-    </w:rPr>
-  </w:style>
-  <w:style w:customStyle="1" w:styleId="Nadpis8Char" w:type="character">
-    <w:name w:val="Nadpis 8 Char"/>
-    <w:basedOn w:val="Standardnpsmoodstavce"/>
-    <w:link w:val="Nadpis8"/>
-    <w:uiPriority w:val="9"/>
-    <w:semiHidden/>
-    <w:rsid w:val="00885B96"/>
-    <w:rPr>
-      <w:rFonts w:cstheme="majorBidi" w:eastAsiaTheme="majorEastAsia"/>
-      <w:i/>
-      <w:iCs/>
-      <w:color w:themeColor="text1" w:themeTint="D8" w:val="272727"/>
-    </w:rPr>
-  </w:style>
-  <w:style w:customStyle="1" w:styleId="Nadpis9Char" w:type="character">
-    <w:name w:val="Nadpis 9 Char"/>
-    <w:basedOn w:val="Standardnpsmoodstavce"/>
-    <w:link w:val="Nadpis9"/>
-    <w:uiPriority w:val="9"/>
-    <w:semiHidden/>
-    <w:rsid w:val="00885B96"/>
-    <w:rPr>
-      <w:rFonts w:cstheme="majorBidi" w:eastAsiaTheme="majorEastAsia"/>
-      <w:color w:themeColor="text1" w:themeTint="D8" w:val="272727"/>
-    </w:rPr>
-  </w:style>
-  <w:style w:styleId="Nzev" w:type="paragraph">
-    <w:name w:val="Title"/>
-    <w:basedOn w:val="Normln"/>
-    <w:next w:val="Normln"/>
-    <w:link w:val="NzevChar"/>
-    <w:uiPriority w:val="10"/>
-    <w:qFormat/>
-    <w:rsid w:val="00885B96"/>
-    <w:pPr>
-      <w:spacing w:after="80" w:line="240" w:lineRule="auto"/>
-      <w:contextualSpacing/>
-    </w:pPr>
-    <w:rPr>
-      <w:rFonts w:asciiTheme="majorHAnsi" w:cstheme="majorBidi" w:eastAsiaTheme="majorEastAsia" w:hAnsiTheme="majorHAnsi"/>
-      <w:spacing w:val="-10"/>
-      <w:kern w:val="28"/>
-      <w:sz w:val="56"/>
-      <w:szCs w:val="56"/>
-    </w:rPr>
-  </w:style>
-  <w:style w:customStyle="1" w:styleId="NzevChar" w:type="character">
-    <w:name w:val="Název Char"/>
-    <w:basedOn w:val="Standardnpsmoodstavce"/>
-    <w:link w:val="Nzev"/>
-    <w:uiPriority w:val="10"/>
-    <w:rsid w:val="00885B96"/>
-    <w:rPr>
-      <w:rFonts w:asciiTheme="majorHAnsi" w:cstheme="majorBidi" w:eastAsiaTheme="majorEastAsia" w:hAnsiTheme="majorHAnsi"/>
-      <w:spacing w:val="-10"/>
-      <w:kern w:val="28"/>
-      <w:sz w:val="56"/>
-      <w:szCs w:val="56"/>
-    </w:rPr>
-  </w:style>
-  <w:style w:styleId="Podnadpis" w:type="paragraph">
-    <w:name w:val="Subtitle"/>
-    <w:basedOn w:val="Normln"/>
-    <w:next w:val="Normln"/>
-    <w:link w:val="PodnadpisChar"/>
-    <w:uiPriority w:val="11"/>
-    <w:qFormat/>
-    <w:rsid w:val="00885B96"/>
-    <w:pPr>
-      <w:numPr>
-        <w:ilvl w:val="1"/>
-      </w:numPr>
-    </w:pPr>
-    <w:rPr>
-      <w:rFonts w:cstheme="majorBidi" w:eastAsiaTheme="majorEastAsia"/>
-      <w:color w:themeColor="text1" w:themeTint="A6" w:val="595959"/>
-      <w:spacing w:val="15"/>
-      <w:sz w:val="28"/>
-      <w:szCs w:val="28"/>
-    </w:rPr>
-  </w:style>
-  <w:style w:customStyle="1" w:styleId="PodnadpisChar" w:type="character">
-    <w:name w:val="Podnadpis Char"/>
-    <w:basedOn w:val="Standardnpsmoodstavce"/>
-    <w:link w:val="Podnadpis"/>
-    <w:uiPriority w:val="11"/>
-    <w:rsid w:val="00885B96"/>
-    <w:rPr>
-      <w:rFonts w:cstheme="majorBidi" w:eastAsiaTheme="majorEastAsia"/>
-      <w:color w:themeColor="text1" w:themeTint="A6" w:val="595959"/>
-      <w:spacing w:val="15"/>
-      <w:sz w:val="28"/>
-      <w:szCs w:val="28"/>
-    </w:rPr>
-  </w:style>
-  <w:style w:styleId="Citt" w:type="paragraph">
-    <w:name w:val="Quote"/>
-    <w:basedOn w:val="Normln"/>
-    <w:next w:val="Normln"/>
-    <w:link w:val="CittChar"/>
-    <w:uiPriority w:val="29"/>
-    <w:qFormat/>
-    <w:rsid w:val="00885B96"/>
-    <w:pPr>
-      <w:spacing w:before="160"/>
-      <w:jc w:val="center"/>
-    </w:pPr>
-    <w:rPr>
-      <w:i/>
-      <w:iCs/>
-      <w:color w:themeColor="text1" w:themeTint="BF" w:val="404040"/>
-    </w:rPr>
-  </w:style>
-  <w:style w:customStyle="1" w:styleId="CittChar" w:type="character">
-    <w:name w:val="Citát Char"/>
-    <w:basedOn w:val="Standardnpsmoodstavce"/>
-    <w:link w:val="Citt"/>
-    <w:uiPriority w:val="29"/>
-    <w:rsid w:val="00885B96"/>
-    <w:rPr>
-      <w:i/>
-      <w:iCs/>
-      <w:color w:themeColor="text1" w:themeTint="BF" w:val="404040"/>
-    </w:rPr>
-  </w:style>
-  <w:style w:styleId="Odstavecseseznamem" w:type="paragraph">
-    <w:name w:val="List Paragraph"/>
-    <w:basedOn w:val="Normln"/>
-    <w:uiPriority w:val="34"/>
-    <w:qFormat/>
-    <w:rsid w:val="00885B96"/>
-    <w:pPr>
-      <w:ind w:left="720"/>
-      <w:contextualSpacing/>
-    </w:pPr>
-  </w:style>
-  <w:style w:styleId="Zdraznnintenzivn" w:type="character">
-    <w:name w:val="Intense Emphasis"/>
-    <w:basedOn w:val="Standardnpsmoodstavce"/>
-    <w:uiPriority w:val="21"/>
-    <w:qFormat/>
-    <w:rsid w:val="00885B96"/>
-    <w:rPr>
-      <w:i/>
-      <w:iCs/>
-      <w:color w:themeColor="accent1" w:themeShade="BF" w:val="0F4761"/>
-    </w:rPr>
-  </w:style>
-  <w:style w:styleId="Vrazncitt" w:type="paragraph">
-    <w:name w:val="Intense Quote"/>
-    <w:basedOn w:val="Normln"/>
-    <w:next w:val="Normln"/>
-    <w:link w:val="VrazncittChar"/>
-    <w:uiPriority w:val="30"/>
-    <w:qFormat/>
-    <w:rsid w:val="00885B96"/>
-    <w:pPr>
-      <w:pBdr>
-        <w:top w:color="0F4761" w:space="10" w:sz="4" w:themeColor="accent1" w:themeShade="BF" w:val="single"/>
-        <w:bottom w:color="0F4761" w:space="10" w:sz="4" w:themeColor="accent1" w:themeShade="BF" w:val="single"/>
-      </w:pBdr>
-      <w:spacing w:after="360" w:before="360"/>
-      <w:ind w:left="864" w:right="864"/>
-      <w:jc w:val="center"/>
-    </w:pPr>
-    <w:rPr>
-      <w:i/>
-      <w:iCs/>
-      <w:color w:themeColor="accent1" w:themeShade="BF" w:val="0F4761"/>
-    </w:rPr>
-  </w:style>
-  <w:style w:customStyle="1" w:styleId="VrazncittChar" w:type="character">
-    <w:name w:val="Výrazný citát Char"/>
-    <w:basedOn w:val="Standardnpsmoodstavce"/>
-    <w:link w:val="Vrazncitt"/>
-    <w:uiPriority w:val="30"/>
-    <w:rsid w:val="00885B96"/>
-    <w:rPr>
-      <w:i/>
-      <w:iCs/>
-      <w:color w:themeColor="accent1" w:themeShade="BF" w:val="0F4761"/>
-    </w:rPr>
-  </w:style>
-  <w:style w:styleId="Odkazintenzivn" w:type="character">
-    <w:name w:val="Intense Reference"/>
-    <w:basedOn w:val="Standardnpsmoodstavce"/>
-    <w:uiPriority w:val="32"/>
-    <w:qFormat/>
-    <w:rsid w:val="00885B96"/>
-    <w:rPr>
-      <w:b/>
-      <w:bCs/>
-      <w:smallCaps/>
-      <w:color w:themeColor="accent1" w:themeShade="BF" w:val="0F4761"/>
-      <w:spacing w:val="5"/>
+      <w:b w:val="0"/>
+      <w:bCs w:val="0"/>
+      <w:color w:themeColor="accent1" w:themeShade="BF" w:val="365F91"/>
     </w:rPr>
   </w:style>
   <w:style w:type="paragraph" w:customStyle="1" w:styleId="SourceCode">
@@ -1975,7 +1720,7 @@
 </file>
 
 <file path=word/theme/theme1.xml><?xml version="1.0" encoding="utf-8"?>
-<a:theme xmlns:a="http://schemas.openxmlformats.org/drawingml/2006/main" name="Motiv Office">
+<a:theme xmlns:a="http://schemas.openxmlformats.org/drawingml/2006/main" name="Office Theme">
   <a:themeElements>
     <a:clrScheme name="Office">
       <a:dk1>
@@ -2180,6 +1925,13 @@
         </a:gradFill>
       </a:fillStyleLst>
       <a:lnStyleLst>
+        <a:ln w="6350" cap="flat" cmpd="sng" algn="ctr">
+          <a:solidFill>
+            <a:schemeClr val="phClr"/>
+          </a:solidFill>
+          <a:prstDash val="solid"/>
+          <a:miter lim="800000"/>
+        </a:ln>
         <a:ln w="12700" cap="flat" cmpd="sng" algn="ctr">
           <a:solidFill>
             <a:schemeClr val="phClr"/>
@@ -2188,13 +1940,6 @@
           <a:miter lim="800000"/>
         </a:ln>
         <a:ln w="19050" cap="flat" cmpd="sng" algn="ctr">
-          <a:solidFill>
-            <a:schemeClr val="phClr"/>
-          </a:solidFill>
-          <a:prstDash val="solid"/>
-          <a:miter lim="800000"/>
-        </a:ln>
-        <a:ln w="25400" cap="flat" cmpd="sng" algn="ctr">
           <a:solidFill>
             <a:schemeClr val="phClr"/>
           </a:solidFill>
@@ -2259,27 +2004,7 @@
       </a:bgFillStyleLst>
     </a:fmtScheme>
   </a:themeElements>
-  <a:objectDefaults>
-    <a:lnDef>
-      <a:spPr/>
-      <a:bodyPr/>
-      <a:lstStyle/>
-      <a:style>
-        <a:lnRef idx="2">
-          <a:schemeClr val="accent1"/>
-        </a:lnRef>
-        <a:fillRef idx="0">
-          <a:schemeClr val="accent1"/>
-        </a:fillRef>
-        <a:effectRef idx="1">
-          <a:schemeClr val="accent1"/>
-        </a:effectRef>
-        <a:fontRef idx="minor">
-          <a:schemeClr val="tx1"/>
-        </a:fontRef>
-      </a:style>
-    </a:lnDef>
-  </a:objectDefaults>
+  <a:objectDefaults/>
   <a:extraClrSchemeLst/>
   <a:extLst>
     <a:ext uri="{05A4C25C-085E-4340-85A3-A5531E510DB2}">

</xml_diff>